<commit_message>
Daily #5 + Bitacora de dailys + Organigrama + Calendario de actividades+ Casos de uso
</commit_message>
<xml_diff>
--- a/Docs/Daily_Scrum/Bitácora de Reuniones Diarias.docx
+++ b/Docs/Daily_Scrum/Bitácora de Reuniones Diarias.docx
@@ -151,8 +151,36 @@
           <w:b/>
           <w:bCs/>
         </w:rPr>
-        <w:t>Bitácora de Reuniones Diarias (Daily Stand-ups): Proyecto SmartTrip Planner</w:t>
-      </w:r>
+        <w:t xml:space="preserve">Bitácora de Reuniones Diarias (Daily Stand-ups): Proyecto </w:t>
+      </w:r>
+      <w:proofErr w:type="spellStart"/>
+      <w:r>
+        <w:rPr>
+          <w:rFonts w:ascii="Times New Roman" w:hAnsi="Times New Roman" w:cs="Times New Roman"/>
+          <w:b/>
+          <w:bCs/>
+        </w:rPr>
+        <w:t>SmartTrip</w:t>
+      </w:r>
+      <w:proofErr w:type="spellEnd"/>
+      <w:r>
+        <w:rPr>
+          <w:rFonts w:ascii="Times New Roman" w:hAnsi="Times New Roman" w:cs="Times New Roman"/>
+          <w:b/>
+          <w:bCs/>
+        </w:rPr>
+        <w:t xml:space="preserve"> </w:t>
+      </w:r>
+      <w:proofErr w:type="spellStart"/>
+      <w:r>
+        <w:rPr>
+          <w:rFonts w:ascii="Times New Roman" w:hAnsi="Times New Roman" w:cs="Times New Roman"/>
+          <w:b/>
+          <w:bCs/>
+        </w:rPr>
+        <w:t>Planner</w:t>
+      </w:r>
+      <w:proofErr w:type="spellEnd"/>
     </w:p>
     <w:p>
       <w:pPr>
@@ -324,7 +352,7 @@
           <w:r>
             <w:fldChar w:fldCharType="separate"/>
           </w:r>
-          <w:hyperlink w:anchor="_Toc240287170" w:history="1">
+          <w:hyperlink w:anchor="_Toc240394450" w:history="1">
             <w:r>
               <w:rPr>
                 <w:rStyle w:val="Hipervnculo"/>
@@ -352,7 +380,7 @@
                 <w:noProof/>
                 <w:webHidden/>
               </w:rPr>
-              <w:instrText xml:space="preserve"> PAGEREF _Toc240287170 \h </w:instrText>
+              <w:instrText xml:space="preserve"> PAGEREF _Toc240394450 \h </w:instrText>
             </w:r>
             <w:r>
               <w:rPr>
@@ -395,7 +423,7 @@
               <w:lang w:eastAsia="es-CO"/>
             </w:rPr>
           </w:pPr>
-          <w:hyperlink w:anchor="_Toc240287171" w:history="1">
+          <w:hyperlink w:anchor="_Toc240394451" w:history="1">
             <w:r>
               <w:rPr>
                 <w:rStyle w:val="Hipervnculo"/>
@@ -423,7 +451,7 @@
                 <w:noProof/>
                 <w:webHidden/>
               </w:rPr>
-              <w:instrText xml:space="preserve"> PAGEREF _Toc240287171 \h </w:instrText>
+              <w:instrText xml:space="preserve"> PAGEREF _Toc240394451 \h </w:instrText>
             </w:r>
             <w:r>
               <w:rPr>
@@ -466,7 +494,7 @@
               <w:lang w:eastAsia="es-CO"/>
             </w:rPr>
           </w:pPr>
-          <w:hyperlink w:anchor="_Toc240287172" w:history="1">
+          <w:hyperlink w:anchor="_Toc240394452" w:history="1">
             <w:r>
               <w:rPr>
                 <w:rStyle w:val="Hipervnculo"/>
@@ -493,7 +521,7 @@
                 <w:noProof/>
                 <w:webHidden/>
               </w:rPr>
-              <w:instrText xml:space="preserve"> PAGEREF _Toc240287172 \h </w:instrText>
+              <w:instrText xml:space="preserve"> PAGEREF _Toc240394452 \h </w:instrText>
             </w:r>
             <w:r>
               <w:rPr>
@@ -536,7 +564,7 @@
               <w:lang w:eastAsia="es-CO"/>
             </w:rPr>
           </w:pPr>
-          <w:hyperlink w:anchor="_Toc240287173" w:history="1">
+          <w:hyperlink w:anchor="_Toc240394453" w:history="1">
             <w:r>
               <w:rPr>
                 <w:rStyle w:val="Hipervnculo"/>
@@ -564,7 +592,7 @@
                 <w:noProof/>
                 <w:webHidden/>
               </w:rPr>
-              <w:instrText xml:space="preserve"> PAGEREF _Toc240287173 \h </w:instrText>
+              <w:instrText xml:space="preserve"> PAGEREF _Toc240394453 \h </w:instrText>
             </w:r>
             <w:r>
               <w:rPr>
@@ -607,14 +635,14 @@
               <w:lang w:eastAsia="es-CO"/>
             </w:rPr>
           </w:pPr>
-          <w:hyperlink w:anchor="_Toc240287174" w:history="1">
+          <w:hyperlink w:anchor="_Toc240394454" w:history="1">
             <w:r>
               <w:rPr>
                 <w:rStyle w:val="Hipervnculo"/>
                 <w:rFonts w:cs="Times New Roman"/>
                 <w:noProof/>
               </w:rPr>
-              <w:t>Sprint 3- Daily Stand-up: 14/9/2026</w:t>
+              <w:t>Sprint 4- Daily Stand-up: 14/9/2026</w:t>
             </w:r>
             <w:r>
               <w:rPr>
@@ -635,7 +663,7 @@
                 <w:noProof/>
                 <w:webHidden/>
               </w:rPr>
-              <w:instrText xml:space="preserve"> PAGEREF _Toc240287174 \h </w:instrText>
+              <w:instrText xml:space="preserve"> PAGEREF _Toc240394454 \h </w:instrText>
             </w:r>
             <w:r>
               <w:rPr>
@@ -656,6 +684,220 @@
                 <w:webHidden/>
               </w:rPr>
               <w:t>9</w:t>
+            </w:r>
+            <w:r>
+              <w:rPr>
+                <w:noProof/>
+                <w:webHidden/>
+              </w:rPr>
+              <w:fldChar w:fldCharType="end"/>
+            </w:r>
+          </w:hyperlink>
+        </w:p>
+        <w:p>
+          <w:pPr>
+            <w:pStyle w:val="TDC2"/>
+            <w:tabs>
+              <w:tab w:val="right" w:leader="dot" w:pos="8828"/>
+            </w:tabs>
+            <w:rPr>
+              <w:rFonts w:eastAsiaTheme="minorEastAsia"/>
+              <w:noProof/>
+              <w:u w:val="single"/>
+              <w:lang w:eastAsia="es-CO"/>
+            </w:rPr>
+          </w:pPr>
+          <w:hyperlink w:anchor="_Toc240394455" w:history="1">
+            <w:r>
+              <w:rPr>
+                <w:rStyle w:val="Hipervnculo"/>
+                <w:rFonts w:cs="Times New Roman"/>
+                <w:noProof/>
+              </w:rPr>
+              <w:t>Sprint 5- Daily Stand-up: 15/9/2026</w:t>
+            </w:r>
+            <w:r>
+              <w:rPr>
+                <w:noProof/>
+                <w:webHidden/>
+              </w:rPr>
+              <w:tab/>
+            </w:r>
+            <w:r>
+              <w:rPr>
+                <w:noProof/>
+                <w:webHidden/>
+              </w:rPr>
+              <w:fldChar w:fldCharType="begin"/>
+            </w:r>
+            <w:r>
+              <w:rPr>
+                <w:noProof/>
+                <w:webHidden/>
+              </w:rPr>
+              <w:instrText xml:space="preserve"> PAGEREF _Toc240394455 \h </w:instrText>
+            </w:r>
+            <w:r>
+              <w:rPr>
+                <w:noProof/>
+                <w:webHidden/>
+              </w:rPr>
+            </w:r>
+            <w:r>
+              <w:rPr>
+                <w:noProof/>
+                <w:webHidden/>
+              </w:rPr>
+              <w:fldChar w:fldCharType="separate"/>
+            </w:r>
+            <w:r>
+              <w:rPr>
+                <w:noProof/>
+                <w:webHidden/>
+              </w:rPr>
+              <w:t>10</w:t>
+            </w:r>
+            <w:r>
+              <w:rPr>
+                <w:noProof/>
+                <w:webHidden/>
+              </w:rPr>
+              <w:fldChar w:fldCharType="end"/>
+            </w:r>
+          </w:hyperlink>
+        </w:p>
+        <w:p>
+          <w:pPr>
+            <w:pStyle w:val="TDC1"/>
+            <w:tabs>
+              <w:tab w:val="right" w:leader="dot" w:pos="8828"/>
+            </w:tabs>
+            <w:rPr>
+              <w:rFonts w:eastAsiaTheme="minorEastAsia"/>
+              <w:noProof/>
+              <w:lang w:eastAsia="es-CO"/>
+            </w:rPr>
+          </w:pPr>
+          <w:hyperlink w:anchor="_Toc240394456" w:history="1">
+            <w:r>
+              <w:rPr>
+                <w:rStyle w:val="Hipervnculo"/>
+                <w:rFonts w:eastAsia="Times New Roman"/>
+                <w:noProof/>
+                <w:lang w:eastAsia="es-CO"/>
+              </w:rPr>
+              <w:t>Calendario de Actividades</w:t>
+            </w:r>
+            <w:r>
+              <w:rPr>
+                <w:noProof/>
+                <w:webHidden/>
+              </w:rPr>
+              <w:tab/>
+            </w:r>
+            <w:r>
+              <w:rPr>
+                <w:noProof/>
+                <w:webHidden/>
+              </w:rPr>
+              <w:fldChar w:fldCharType="begin"/>
+            </w:r>
+            <w:r>
+              <w:rPr>
+                <w:noProof/>
+                <w:webHidden/>
+              </w:rPr>
+              <w:instrText xml:space="preserve"> PAGEREF _Toc240394456 \h </w:instrText>
+            </w:r>
+            <w:r>
+              <w:rPr>
+                <w:noProof/>
+                <w:webHidden/>
+              </w:rPr>
+            </w:r>
+            <w:r>
+              <w:rPr>
+                <w:noProof/>
+                <w:webHidden/>
+              </w:rPr>
+              <w:fldChar w:fldCharType="separate"/>
+            </w:r>
+            <w:r>
+              <w:rPr>
+                <w:noProof/>
+                <w:webHidden/>
+              </w:rPr>
+              <w:t>11</w:t>
+            </w:r>
+            <w:r>
+              <w:rPr>
+                <w:noProof/>
+                <w:webHidden/>
+              </w:rPr>
+              <w:fldChar w:fldCharType="end"/>
+            </w:r>
+          </w:hyperlink>
+        </w:p>
+        <w:p>
+          <w:pPr>
+            <w:pStyle w:val="TDC1"/>
+            <w:tabs>
+              <w:tab w:val="right" w:leader="dot" w:pos="8828"/>
+            </w:tabs>
+            <w:rPr>
+              <w:rFonts w:eastAsiaTheme="minorEastAsia"/>
+              <w:noProof/>
+              <w:lang w:eastAsia="es-CO"/>
+            </w:rPr>
+          </w:pPr>
+          <w:hyperlink w:anchor="_Toc240394457" w:history="1">
+            <w:r>
+              <w:rPr>
+                <w:rStyle w:val="Hipervnculo"/>
+                <w:noProof/>
+              </w:rPr>
+              <w:t>Organigrama</w:t>
+            </w:r>
+            <w:r>
+              <w:rPr>
+                <w:noProof/>
+                <w:webHidden/>
+              </w:rPr>
+              <w:tab/>
+            </w:r>
+            <w:r>
+              <w:rPr>
+                <w:noProof/>
+                <w:webHidden/>
+              </w:rPr>
+              <w:fldChar w:fldCharType="begin"/>
+            </w:r>
+            <w:r>
+              <w:rPr>
+                <w:noProof/>
+                <w:webHidden/>
+              </w:rPr>
+              <w:instrText xml:space="preserve"> PAGEREF _Toc240394457 \h </w:instrText>
+            </w:r>
+            <w:r>
+              <w:rPr>
+                <w:noProof/>
+                <w:webHidden/>
+              </w:rPr>
+            </w:r>
+            <w:r>
+              <w:rPr>
+                <w:noProof/>
+                <w:webHidden/>
+              </w:rPr>
+              <w:fldChar w:fldCharType="separate"/>
+            </w:r>
+            <w:r>
+              <w:rPr>
+                <w:noProof/>
+                <w:webHidden/>
+              </w:rPr>
+              <w:t>12</w:t>
             </w:r>
             <w:r>
               <w:rPr>
@@ -707,33 +949,131 @@
           <w:bCs/>
         </w:rPr>
         <w:lastRenderedPageBreak/>
-        <w:t>Bitácora de Reuniones Diarias (Daily Stand-ups): Proyecto SmartTrip Planner</w:t>
-      </w:r>
-    </w:p>
-    <w:p>
-      <w:pPr>
-        <w:rPr>
-          <w:rFonts w:ascii="Times New Roman" w:hAnsi="Times New Roman" w:cs="Times New Roman"/>
-        </w:rPr>
-      </w:pPr>
-      <w:r>
-        <w:rPr>
-          <w:rFonts w:ascii="Times New Roman" w:hAnsi="Times New Roman" w:cs="Times New Roman"/>
-        </w:rPr>
-        <w:t>El presente documento tiene como propósito registrar y documentar las reuniones diarias de seguimiento (Daily Stand-ups) realizadas por el equipo de desarrollo "Modo Avión" durante la construcción de la aplicación web SmartTrip Planner. Este proyecto, enmarcado dentro de la asignatura Fundamentos de Ingeniería de Software, busca desarrollar una plataforma centralizada para la planificación de viajes, integrando servicios externos como Google Maps y APIs de vuelos para generar itinerarios personalizados y eficientes basados en los intereses, presupuesto y tiempo disponible del usuario.</w:t>
-      </w:r>
-    </w:p>
-    <w:p>
-      <w:pPr>
-        <w:rPr>
-          <w:rFonts w:ascii="Times New Roman" w:hAnsi="Times New Roman" w:cs="Times New Roman"/>
-        </w:rPr>
-      </w:pPr>
-      <w:r>
-        <w:rPr>
-          <w:rFonts w:ascii="Times New Roman" w:hAnsi="Times New Roman" w:cs="Times New Roman"/>
-        </w:rPr>
-        <w:t>Para garantizar la correcta ejecución del proyecto bajo un marco de trabajo ágil (Scrum), se realizan reuniones diarias de corta duración. En estas sesiones, cada miembro del equipo expone su progreso, sus metas para el día y cualquier impedimento que esté bloqueando su trabajo, facilitando así la labor del Scrum Master y del equipo en general para asegurar la entrega de las funcionalidades descritas en el alcance del sistema.</w:t>
+        <w:t xml:space="preserve">Bitácora de Reuniones Diarias (Daily Stand-ups): Proyecto </w:t>
+      </w:r>
+      <w:proofErr w:type="spellStart"/>
+      <w:r>
+        <w:rPr>
+          <w:rFonts w:ascii="Times New Roman" w:hAnsi="Times New Roman" w:cs="Times New Roman"/>
+          <w:b/>
+          <w:bCs/>
+        </w:rPr>
+        <w:t>SmartTrip</w:t>
+      </w:r>
+      <w:proofErr w:type="spellEnd"/>
+      <w:r>
+        <w:rPr>
+          <w:rFonts w:ascii="Times New Roman" w:hAnsi="Times New Roman" w:cs="Times New Roman"/>
+          <w:b/>
+          <w:bCs/>
+        </w:rPr>
+        <w:t xml:space="preserve"> </w:t>
+      </w:r>
+      <w:proofErr w:type="spellStart"/>
+      <w:r>
+        <w:rPr>
+          <w:rFonts w:ascii="Times New Roman" w:hAnsi="Times New Roman" w:cs="Times New Roman"/>
+          <w:b/>
+          <w:bCs/>
+        </w:rPr>
+        <w:t>Planner</w:t>
+      </w:r>
+      <w:proofErr w:type="spellEnd"/>
+    </w:p>
+    <w:p>
+      <w:pPr>
+        <w:rPr>
+          <w:rFonts w:ascii="Times New Roman" w:hAnsi="Times New Roman" w:cs="Times New Roman"/>
+        </w:rPr>
+      </w:pPr>
+      <w:r>
+        <w:rPr>
+          <w:rFonts w:ascii="Times New Roman" w:hAnsi="Times New Roman" w:cs="Times New Roman"/>
+        </w:rPr>
+        <w:t xml:space="preserve">El presente documento tiene como propósito registrar y documentar las reuniones diarias de seguimiento (Daily Stand-ups) realizadas por el equipo de desarrollo "Modo Avión" durante la construcción de la aplicación web </w:t>
+      </w:r>
+      <w:proofErr w:type="spellStart"/>
+      <w:r>
+        <w:rPr>
+          <w:rFonts w:ascii="Times New Roman" w:hAnsi="Times New Roman" w:cs="Times New Roman"/>
+        </w:rPr>
+        <w:t>SmartTrip</w:t>
+      </w:r>
+      <w:proofErr w:type="spellEnd"/>
+      <w:r>
+        <w:rPr>
+          <w:rFonts w:ascii="Times New Roman" w:hAnsi="Times New Roman" w:cs="Times New Roman"/>
+        </w:rPr>
+        <w:t xml:space="preserve"> </w:t>
+      </w:r>
+      <w:proofErr w:type="spellStart"/>
+      <w:r>
+        <w:rPr>
+          <w:rFonts w:ascii="Times New Roman" w:hAnsi="Times New Roman" w:cs="Times New Roman"/>
+        </w:rPr>
+        <w:t>Planner</w:t>
+      </w:r>
+      <w:proofErr w:type="spellEnd"/>
+      <w:r>
+        <w:rPr>
+          <w:rFonts w:ascii="Times New Roman" w:hAnsi="Times New Roman" w:cs="Times New Roman"/>
+        </w:rPr>
+        <w:t xml:space="preserve">. Este proyecto, enmarcado dentro de la asignatura Fundamentos de Ingeniería de Software, busca desarrollar una plataforma centralizada para la planificación de viajes, integrando servicios externos como Google </w:t>
+      </w:r>
+      <w:proofErr w:type="spellStart"/>
+      <w:r>
+        <w:rPr>
+          <w:rFonts w:ascii="Times New Roman" w:hAnsi="Times New Roman" w:cs="Times New Roman"/>
+        </w:rPr>
+        <w:t>Maps</w:t>
+      </w:r>
+      <w:proofErr w:type="spellEnd"/>
+      <w:r>
+        <w:rPr>
+          <w:rFonts w:ascii="Times New Roman" w:hAnsi="Times New Roman" w:cs="Times New Roman"/>
+        </w:rPr>
+        <w:t xml:space="preserve"> y </w:t>
+      </w:r>
+      <w:proofErr w:type="spellStart"/>
+      <w:r>
+        <w:rPr>
+          <w:rFonts w:ascii="Times New Roman" w:hAnsi="Times New Roman" w:cs="Times New Roman"/>
+        </w:rPr>
+        <w:t>APIs</w:t>
+      </w:r>
+      <w:proofErr w:type="spellEnd"/>
+      <w:r>
+        <w:rPr>
+          <w:rFonts w:ascii="Times New Roman" w:hAnsi="Times New Roman" w:cs="Times New Roman"/>
+        </w:rPr>
+        <w:t xml:space="preserve"> de vuelos para generar itinerarios personalizados y eficientes basados en los intereses, presupuesto y tiempo disponible del usuario.</w:t>
+      </w:r>
+    </w:p>
+    <w:p>
+      <w:pPr>
+        <w:rPr>
+          <w:rFonts w:ascii="Times New Roman" w:hAnsi="Times New Roman" w:cs="Times New Roman"/>
+        </w:rPr>
+      </w:pPr>
+      <w:r>
+        <w:rPr>
+          <w:rFonts w:ascii="Times New Roman" w:hAnsi="Times New Roman" w:cs="Times New Roman"/>
+        </w:rPr>
+        <w:t xml:space="preserve">Para garantizar la correcta ejecución del proyecto bajo un marco de trabajo ágil (Scrum), se realizan reuniones diarias de corta duración. En estas sesiones, cada miembro del equipo expone su progreso, sus metas para el día y cualquier impedimento que esté bloqueando su trabajo, facilitando así la labor del Scrum </w:t>
+      </w:r>
+      <w:proofErr w:type="gramStart"/>
+      <w:r>
+        <w:rPr>
+          <w:rFonts w:ascii="Times New Roman" w:hAnsi="Times New Roman" w:cs="Times New Roman"/>
+        </w:rPr>
+        <w:t>Master</w:t>
+      </w:r>
+      <w:proofErr w:type="gramEnd"/>
+      <w:r>
+        <w:rPr>
+          <w:rFonts w:ascii="Times New Roman" w:hAnsi="Times New Roman" w:cs="Times New Roman"/>
+        </w:rPr>
+        <w:t xml:space="preserve"> y del equipo en general para asegurar la entrega de las funcionalidades descritas en el alcance del sistema.</w:t>
       </w:r>
     </w:p>
     <w:p>
@@ -809,7 +1149,21 @@
         <w:rPr>
           <w:rFonts w:ascii="Times New Roman" w:hAnsi="Times New Roman" w:cs="Times New Roman"/>
         </w:rPr>
-        <w:t> Scrum Master y Líder del proyecto. Encargada de la coordinación del equipo, seguimiento del proyecto y gestión de requisitos.</w:t>
+        <w:t xml:space="preserve"> Scrum </w:t>
+      </w:r>
+      <w:proofErr w:type="gramStart"/>
+      <w:r>
+        <w:rPr>
+          <w:rFonts w:ascii="Times New Roman" w:hAnsi="Times New Roman" w:cs="Times New Roman"/>
+        </w:rPr>
+        <w:t>Master</w:t>
+      </w:r>
+      <w:proofErr w:type="gramEnd"/>
+      <w:r>
+        <w:rPr>
+          <w:rFonts w:ascii="Times New Roman" w:hAnsi="Times New Roman" w:cs="Times New Roman"/>
+        </w:rPr>
+        <w:t xml:space="preserve"> y Líder del proyecto. Encargada de la coordinación del equipo, seguimiento del proyecto y gestión de requisitos.</w:t>
       </w:r>
     </w:p>
     <w:p>
@@ -834,7 +1188,49 @@
         <w:rPr>
           <w:rFonts w:ascii="Times New Roman" w:hAnsi="Times New Roman" w:cs="Times New Roman"/>
         </w:rPr>
-        <w:t> Product Owner y Desarrollador Backend (Java, Spring Boot). Responsable de la lógica de negocio y endpoints.</w:t>
+        <w:t> </w:t>
+      </w:r>
+      <w:proofErr w:type="spellStart"/>
+      <w:r>
+        <w:rPr>
+          <w:rFonts w:ascii="Times New Roman" w:hAnsi="Times New Roman" w:cs="Times New Roman"/>
+        </w:rPr>
+        <w:t>Product</w:t>
+      </w:r>
+      <w:proofErr w:type="spellEnd"/>
+      <w:r>
+        <w:rPr>
+          <w:rFonts w:ascii="Times New Roman" w:hAnsi="Times New Roman" w:cs="Times New Roman"/>
+        </w:rPr>
+        <w:t xml:space="preserve"> Owner y Desarrollador </w:t>
+      </w:r>
+      <w:proofErr w:type="spellStart"/>
+      <w:r>
+        <w:rPr>
+          <w:rFonts w:ascii="Times New Roman" w:hAnsi="Times New Roman" w:cs="Times New Roman"/>
+        </w:rPr>
+        <w:t>Backend</w:t>
+      </w:r>
+      <w:proofErr w:type="spellEnd"/>
+      <w:r>
+        <w:rPr>
+          <w:rFonts w:ascii="Times New Roman" w:hAnsi="Times New Roman" w:cs="Times New Roman"/>
+        </w:rPr>
+        <w:t xml:space="preserve"> (Java, Spring Boot). Responsable de la lógica de negocio y </w:t>
+      </w:r>
+      <w:proofErr w:type="spellStart"/>
+      <w:r>
+        <w:rPr>
+          <w:rFonts w:ascii="Times New Roman" w:hAnsi="Times New Roman" w:cs="Times New Roman"/>
+        </w:rPr>
+        <w:t>endpoints</w:t>
+      </w:r>
+      <w:proofErr w:type="spellEnd"/>
+      <w:r>
+        <w:rPr>
+          <w:rFonts w:ascii="Times New Roman" w:hAnsi="Times New Roman" w:cs="Times New Roman"/>
+        </w:rPr>
+        <w:t>.</w:t>
       </w:r>
     </w:p>
     <w:p>
@@ -884,7 +1280,49 @@
         <w:rPr>
           <w:rFonts w:ascii="Times New Roman" w:hAnsi="Times New Roman" w:cs="Times New Roman"/>
         </w:rPr>
-        <w:t> Configuration Manager, DevOps Engineer y Desarrollador Frontend (React, Vite). Responsable de interfaces y consumo de API.</w:t>
+        <w:t> </w:t>
+      </w:r>
+      <w:proofErr w:type="spellStart"/>
+      <w:r>
+        <w:rPr>
+          <w:rFonts w:ascii="Times New Roman" w:hAnsi="Times New Roman" w:cs="Times New Roman"/>
+        </w:rPr>
+        <w:t>Configuration</w:t>
+      </w:r>
+      <w:proofErr w:type="spellEnd"/>
+      <w:r>
+        <w:rPr>
+          <w:rFonts w:ascii="Times New Roman" w:hAnsi="Times New Roman" w:cs="Times New Roman"/>
+        </w:rPr>
+        <w:t xml:space="preserve"> Manager, DevOps Engineer y Desarrollador </w:t>
+      </w:r>
+      <w:proofErr w:type="spellStart"/>
+      <w:r>
+        <w:rPr>
+          <w:rFonts w:ascii="Times New Roman" w:hAnsi="Times New Roman" w:cs="Times New Roman"/>
+        </w:rPr>
+        <w:t>Frontend</w:t>
+      </w:r>
+      <w:proofErr w:type="spellEnd"/>
+      <w:r>
+        <w:rPr>
+          <w:rFonts w:ascii="Times New Roman" w:hAnsi="Times New Roman" w:cs="Times New Roman"/>
+        </w:rPr>
+        <w:t xml:space="preserve"> (</w:t>
+      </w:r>
+      <w:proofErr w:type="spellStart"/>
+      <w:r>
+        <w:rPr>
+          <w:rFonts w:ascii="Times New Roman" w:hAnsi="Times New Roman" w:cs="Times New Roman"/>
+        </w:rPr>
+        <w:t>React</w:t>
+      </w:r>
+      <w:proofErr w:type="spellEnd"/>
+      <w:r>
+        <w:rPr>
+          <w:rFonts w:ascii="Times New Roman" w:hAnsi="Times New Roman" w:cs="Times New Roman"/>
+        </w:rPr>
+        <w:t>, Vite). Responsable de interfaces y consumo de API.</w:t>
       </w:r>
     </w:p>
     <w:p>
@@ -949,7 +1387,21 @@
         <w:rPr>
           <w:rFonts w:ascii="Times New Roman" w:hAnsi="Times New Roman" w:cs="Times New Roman"/>
         </w:rPr>
-        <w:t>A continuación, se presenta la bitácora de las reuniones diarias organizadas por Sprints. El siguiente formato se replica para cada día de trabajo colaborativo del equipo.</w:t>
+        <w:t xml:space="preserve">A continuación, se presenta la bitácora de las reuniones diarias organizadas por </w:t>
+      </w:r>
+      <w:proofErr w:type="spellStart"/>
+      <w:r>
+        <w:rPr>
+          <w:rFonts w:ascii="Times New Roman" w:hAnsi="Times New Roman" w:cs="Times New Roman"/>
+        </w:rPr>
+        <w:t>Sprints</w:t>
+      </w:r>
+      <w:proofErr w:type="spellEnd"/>
+      <w:r>
+        <w:rPr>
+          <w:rFonts w:ascii="Times New Roman" w:hAnsi="Times New Roman" w:cs="Times New Roman"/>
+        </w:rPr>
+        <w:t>. El siguiente formato se replica para cada día de trabajo colaborativo del equipo.</w:t>
       </w:r>
     </w:p>
     <w:p>
@@ -966,7 +1418,7 @@
           <w:rFonts w:ascii="Times New Roman" w:hAnsi="Times New Roman" w:cs="Times New Roman"/>
         </w:rPr>
       </w:pPr>
-      <w:bookmarkStart w:id="0" w:name="_Toc240287170"/>
+      <w:bookmarkStart w:id="0" w:name="_Toc240394450"/>
       <w:r>
         <w:rPr>
           <w:rFonts w:ascii="Times New Roman" w:hAnsi="Times New Roman" w:cs="Times New Roman"/>
@@ -1002,7 +1454,7 @@
           <w:rFonts w:cs="Times New Roman"/>
         </w:rPr>
       </w:pPr>
-      <w:bookmarkStart w:id="1" w:name="_Toc240287171"/>
+      <w:bookmarkStart w:id="1" w:name="_Toc240394451"/>
       <w:r>
         <w:rPr>
           <w:rFonts w:cs="Times New Roman"/>
@@ -1025,13 +1477,29 @@
           <w:b/>
           <w:bCs/>
         </w:rPr>
-        <w:t>Hora de inicio:</w:t>
-      </w:r>
-      <w:r>
-        <w:rPr>
-          <w:rFonts w:ascii="Times New Roman" w:hAnsi="Times New Roman" w:cs="Times New Roman"/>
-        </w:rPr>
-        <w:t>15:00 | </w:t>
+        <w:t xml:space="preserve">Hora de </w:t>
+      </w:r>
+      <w:proofErr w:type="gramStart"/>
+      <w:r>
+        <w:rPr>
+          <w:rFonts w:ascii="Times New Roman" w:hAnsi="Times New Roman" w:cs="Times New Roman"/>
+          <w:b/>
+          <w:bCs/>
+        </w:rPr>
+        <w:t>inicio:</w:t>
+      </w:r>
+      <w:r>
+        <w:rPr>
+          <w:rFonts w:ascii="Times New Roman" w:hAnsi="Times New Roman" w:cs="Times New Roman"/>
+        </w:rPr>
+        <w:t>15:00</w:t>
+      </w:r>
+      <w:proofErr w:type="gramEnd"/>
+      <w:r>
+        <w:rPr>
+          <w:rFonts w:ascii="Times New Roman" w:hAnsi="Times New Roman" w:cs="Times New Roman"/>
+        </w:rPr>
+        <w:t xml:space="preserve"> | </w:t>
       </w:r>
       <w:r>
         <w:rPr>
@@ -1097,7 +1565,25 @@
           <w:b/>
           <w:bCs/>
         </w:rPr>
-        <w:t>Laura S. Carrero Guevara (Scrum Master / Líder)</w:t>
+        <w:t xml:space="preserve">Laura S. Carrero Guevara (Scrum </w:t>
+      </w:r>
+      <w:proofErr w:type="gramStart"/>
+      <w:r>
+        <w:rPr>
+          <w:rFonts w:ascii="Times New Roman" w:hAnsi="Times New Roman" w:cs="Times New Roman"/>
+          <w:b/>
+          <w:bCs/>
+        </w:rPr>
+        <w:t>Master</w:t>
+      </w:r>
+      <w:proofErr w:type="gramEnd"/>
+      <w:r>
+        <w:rPr>
+          <w:rFonts w:ascii="Times New Roman" w:hAnsi="Times New Roman" w:cs="Times New Roman"/>
+          <w:b/>
+          <w:bCs/>
+        </w:rPr>
+        <w:t xml:space="preserve"> / Líder)</w:t>
       </w:r>
       <w:r>
         <w:rPr>
@@ -1131,7 +1617,25 @@
           <w:i/>
           <w:iCs/>
         </w:rPr>
-        <w:t>¿Qué voy a hacer hoy?:  revisar las HU</w:t>
+        <w:t>¿Qué voy a hacer hoy</w:t>
+      </w:r>
+      <w:proofErr w:type="gramStart"/>
+      <w:r>
+        <w:rPr>
+          <w:rFonts w:ascii="Times New Roman" w:hAnsi="Times New Roman" w:cs="Times New Roman"/>
+          <w:i/>
+          <w:iCs/>
+        </w:rPr>
+        <w:t>?:  revisar</w:t>
+      </w:r>
+      <w:proofErr w:type="gramEnd"/>
+      <w:r>
+        <w:rPr>
+          <w:rFonts w:ascii="Times New Roman" w:hAnsi="Times New Roman" w:cs="Times New Roman"/>
+          <w:i/>
+          <w:iCs/>
+        </w:rPr>
+        <w:t xml:space="preserve"> las HU</w:t>
       </w:r>
       <w:r>
         <w:rPr>
@@ -1172,7 +1676,43 @@
           <w:b/>
           <w:bCs/>
         </w:rPr>
-        <w:t>Juan F. Chaparro Jurado (Product Owner / Backend)</w:t>
+        <w:t>Juan F. Chaparro Jurado (</w:t>
+      </w:r>
+      <w:proofErr w:type="spellStart"/>
+      <w:r>
+        <w:rPr>
+          <w:rFonts w:ascii="Times New Roman" w:hAnsi="Times New Roman" w:cs="Times New Roman"/>
+          <w:b/>
+          <w:bCs/>
+        </w:rPr>
+        <w:t>Product</w:t>
+      </w:r>
+      <w:proofErr w:type="spellEnd"/>
+      <w:r>
+        <w:rPr>
+          <w:rFonts w:ascii="Times New Roman" w:hAnsi="Times New Roman" w:cs="Times New Roman"/>
+          <w:b/>
+          <w:bCs/>
+        </w:rPr>
+        <w:t xml:space="preserve"> Owner / </w:t>
+      </w:r>
+      <w:proofErr w:type="spellStart"/>
+      <w:r>
+        <w:rPr>
+          <w:rFonts w:ascii="Times New Roman" w:hAnsi="Times New Roman" w:cs="Times New Roman"/>
+          <w:b/>
+          <w:bCs/>
+        </w:rPr>
+        <w:t>Backend</w:t>
+      </w:r>
+      <w:proofErr w:type="spellEnd"/>
+      <w:r>
+        <w:rPr>
+          <w:rFonts w:ascii="Times New Roman" w:hAnsi="Times New Roman" w:cs="Times New Roman"/>
+          <w:b/>
+          <w:bCs/>
+        </w:rPr>
+        <w:t>)</w:t>
       </w:r>
       <w:r>
         <w:rPr>
@@ -1305,7 +1845,21 @@
         <w:rPr>
           <w:rFonts w:ascii="Times New Roman" w:hAnsi="Times New Roman" w:cs="Times New Roman"/>
         </w:rPr>
-        <w:t>buscar cual es la base de datos  que se usara en el proyecto</w:t>
+        <w:t xml:space="preserve">buscar cual es la base de </w:t>
+      </w:r>
+      <w:proofErr w:type="gramStart"/>
+      <w:r>
+        <w:rPr>
+          <w:rFonts w:ascii="Times New Roman" w:hAnsi="Times New Roman" w:cs="Times New Roman"/>
+        </w:rPr>
+        <w:t>datos  que</w:t>
+      </w:r>
+      <w:proofErr w:type="gramEnd"/>
+      <w:r>
+        <w:rPr>
+          <w:rFonts w:ascii="Times New Roman" w:hAnsi="Times New Roman" w:cs="Times New Roman"/>
+        </w:rPr>
+        <w:t xml:space="preserve"> se usara en el proyecto</w:t>
       </w:r>
       <w:r>
         <w:rPr>
@@ -1352,7 +1906,43 @@
           <w:b/>
           <w:bCs/>
         </w:rPr>
-        <w:t>Nikolas H. García Cure (DevOps / Frontend)</w:t>
+        <w:t xml:space="preserve">Nikolas H. García </w:t>
+      </w:r>
+      <w:proofErr w:type="gramStart"/>
+      <w:r>
+        <w:rPr>
+          <w:rFonts w:ascii="Times New Roman" w:hAnsi="Times New Roman" w:cs="Times New Roman"/>
+          <w:b/>
+          <w:bCs/>
+        </w:rPr>
+        <w:t>Cure</w:t>
+      </w:r>
+      <w:proofErr w:type="gramEnd"/>
+      <w:r>
+        <w:rPr>
+          <w:rFonts w:ascii="Times New Roman" w:hAnsi="Times New Roman" w:cs="Times New Roman"/>
+          <w:b/>
+          <w:bCs/>
+        </w:rPr>
+        <w:t xml:space="preserve"> (DevOps / </w:t>
+      </w:r>
+      <w:proofErr w:type="spellStart"/>
+      <w:r>
+        <w:rPr>
+          <w:rFonts w:ascii="Times New Roman" w:hAnsi="Times New Roman" w:cs="Times New Roman"/>
+          <w:b/>
+          <w:bCs/>
+        </w:rPr>
+        <w:t>Frontend</w:t>
+      </w:r>
+      <w:proofErr w:type="spellEnd"/>
+      <w:r>
+        <w:rPr>
+          <w:rFonts w:ascii="Times New Roman" w:hAnsi="Times New Roman" w:cs="Times New Roman"/>
+          <w:b/>
+          <w:bCs/>
+        </w:rPr>
+        <w:t>)</w:t>
       </w:r>
       <w:r>
         <w:rPr>
@@ -1394,7 +1984,43 @@
           <w:i/>
           <w:iCs/>
         </w:rPr>
-        <w:t xml:space="preserve"> Organizar las ramas del proyecto en main -Develop-Feacture/HU</w:t>
+        <w:t xml:space="preserve"> Organizar las ramas del proyecto en </w:t>
+      </w:r>
+      <w:proofErr w:type="spellStart"/>
+      <w:r>
+        <w:rPr>
+          <w:rFonts w:ascii="Times New Roman" w:hAnsi="Times New Roman" w:cs="Times New Roman"/>
+          <w:i/>
+          <w:iCs/>
+        </w:rPr>
+        <w:t>main</w:t>
+      </w:r>
+      <w:proofErr w:type="spellEnd"/>
+      <w:r>
+        <w:rPr>
+          <w:rFonts w:ascii="Times New Roman" w:hAnsi="Times New Roman" w:cs="Times New Roman"/>
+          <w:i/>
+          <w:iCs/>
+        </w:rPr>
+        <w:t xml:space="preserve"> -</w:t>
+      </w:r>
+      <w:proofErr w:type="spellStart"/>
+      <w:r>
+        <w:rPr>
+          <w:rFonts w:ascii="Times New Roman" w:hAnsi="Times New Roman" w:cs="Times New Roman"/>
+          <w:i/>
+          <w:iCs/>
+        </w:rPr>
+        <w:t>Develop-Feacture</w:t>
+      </w:r>
+      <w:proofErr w:type="spellEnd"/>
+      <w:r>
+        <w:rPr>
+          <w:rFonts w:ascii="Times New Roman" w:hAnsi="Times New Roman" w:cs="Times New Roman"/>
+          <w:i/>
+          <w:iCs/>
+        </w:rPr>
+        <w:t>/HU</w:t>
       </w:r>
       <w:r>
         <w:rPr>
@@ -1463,7 +2089,7 @@
         <w:pStyle w:val="Ttulo2"/>
         <w:ind w:firstLine="0"/>
       </w:pPr>
-      <w:bookmarkStart w:id="2" w:name="_Toc240287172"/>
+      <w:bookmarkStart w:id="2" w:name="_Toc240394452"/>
       <w:r>
         <w:lastRenderedPageBreak/>
         <w:t>Sprint 2- Daily Stand-up: 12/9/2026</w:t>
@@ -1483,13 +2109,29 @@
           <w:b/>
           <w:bCs/>
         </w:rPr>
-        <w:t>Hora de inicio:</w:t>
-      </w:r>
-      <w:r>
-        <w:rPr>
-          <w:rFonts w:ascii="Times New Roman" w:hAnsi="Times New Roman" w:cs="Times New Roman"/>
-        </w:rPr>
-        <w:t>14:20 | </w:t>
+        <w:t xml:space="preserve">Hora de </w:t>
+      </w:r>
+      <w:proofErr w:type="gramStart"/>
+      <w:r>
+        <w:rPr>
+          <w:rFonts w:ascii="Times New Roman" w:hAnsi="Times New Roman" w:cs="Times New Roman"/>
+          <w:b/>
+          <w:bCs/>
+        </w:rPr>
+        <w:t>inicio:</w:t>
+      </w:r>
+      <w:r>
+        <w:rPr>
+          <w:rFonts w:ascii="Times New Roman" w:hAnsi="Times New Roman" w:cs="Times New Roman"/>
+        </w:rPr>
+        <w:t>14:20</w:t>
+      </w:r>
+      <w:proofErr w:type="gramEnd"/>
+      <w:r>
+        <w:rPr>
+          <w:rFonts w:ascii="Times New Roman" w:hAnsi="Times New Roman" w:cs="Times New Roman"/>
+        </w:rPr>
+        <w:t xml:space="preserve"> | </w:t>
       </w:r>
       <w:r>
         <w:rPr>
@@ -1555,7 +2197,25 @@
           <w:b/>
           <w:bCs/>
         </w:rPr>
-        <w:t>Laura S. Carrero Guevara (Scrum Master / Líder)</w:t>
+        <w:t xml:space="preserve">Laura S. Carrero Guevara (Scrum </w:t>
+      </w:r>
+      <w:proofErr w:type="gramStart"/>
+      <w:r>
+        <w:rPr>
+          <w:rFonts w:ascii="Times New Roman" w:hAnsi="Times New Roman" w:cs="Times New Roman"/>
+          <w:b/>
+          <w:bCs/>
+        </w:rPr>
+        <w:t>Master</w:t>
+      </w:r>
+      <w:proofErr w:type="gramEnd"/>
+      <w:r>
+        <w:rPr>
+          <w:rFonts w:ascii="Times New Roman" w:hAnsi="Times New Roman" w:cs="Times New Roman"/>
+          <w:b/>
+          <w:bCs/>
+        </w:rPr>
+        <w:t xml:space="preserve"> / Líder)</w:t>
       </w:r>
       <w:r>
         <w:rPr>
@@ -1589,7 +2249,25 @@
           <w:i/>
           <w:iCs/>
         </w:rPr>
-        <w:t>¿Qué voy a hacer hoy?:  planear mis próximas actividades</w:t>
+        <w:t>¿Qué voy a hacer hoy</w:t>
+      </w:r>
+      <w:proofErr w:type="gramStart"/>
+      <w:r>
+        <w:rPr>
+          <w:rFonts w:ascii="Times New Roman" w:hAnsi="Times New Roman" w:cs="Times New Roman"/>
+          <w:i/>
+          <w:iCs/>
+        </w:rPr>
+        <w:t>?:  planear</w:t>
+      </w:r>
+      <w:proofErr w:type="gramEnd"/>
+      <w:r>
+        <w:rPr>
+          <w:rFonts w:ascii="Times New Roman" w:hAnsi="Times New Roman" w:cs="Times New Roman"/>
+          <w:i/>
+          <w:iCs/>
+        </w:rPr>
+        <w:t xml:space="preserve"> mis próximas actividades</w:t>
       </w:r>
       <w:r>
         <w:rPr>
@@ -1624,7 +2302,43 @@
           <w:b/>
           <w:bCs/>
         </w:rPr>
-        <w:t>Juan F. Chaparro Jurado (Product Owner / Backend)</w:t>
+        <w:t>Juan F. Chaparro Jurado (</w:t>
+      </w:r>
+      <w:proofErr w:type="spellStart"/>
+      <w:r>
+        <w:rPr>
+          <w:rFonts w:ascii="Times New Roman" w:hAnsi="Times New Roman" w:cs="Times New Roman"/>
+          <w:b/>
+          <w:bCs/>
+        </w:rPr>
+        <w:t>Product</w:t>
+      </w:r>
+      <w:proofErr w:type="spellEnd"/>
+      <w:r>
+        <w:rPr>
+          <w:rFonts w:ascii="Times New Roman" w:hAnsi="Times New Roman" w:cs="Times New Roman"/>
+          <w:b/>
+          <w:bCs/>
+        </w:rPr>
+        <w:t xml:space="preserve"> Owner / </w:t>
+      </w:r>
+      <w:proofErr w:type="spellStart"/>
+      <w:r>
+        <w:rPr>
+          <w:rFonts w:ascii="Times New Roman" w:hAnsi="Times New Roman" w:cs="Times New Roman"/>
+          <w:b/>
+          <w:bCs/>
+        </w:rPr>
+        <w:t>Backend</w:t>
+      </w:r>
+      <w:proofErr w:type="spellEnd"/>
+      <w:r>
+        <w:rPr>
+          <w:rFonts w:ascii="Times New Roman" w:hAnsi="Times New Roman" w:cs="Times New Roman"/>
+          <w:b/>
+          <w:bCs/>
+        </w:rPr>
+        <w:t>)</w:t>
       </w:r>
       <w:r>
         <w:rPr>
@@ -1733,88 +2447,182 @@
           <w:i/>
           <w:iCs/>
         </w:rPr>
+        <w:t>¿Qué voy a hacer hoy</w:t>
+      </w:r>
+      <w:proofErr w:type="gramStart"/>
+      <w:r>
+        <w:rPr>
+          <w:rFonts w:ascii="Times New Roman" w:hAnsi="Times New Roman" w:cs="Times New Roman"/>
+          <w:i/>
+          <w:iCs/>
+        </w:rPr>
+        <w:t>?:</w:t>
+      </w:r>
+      <w:r>
+        <w:rPr>
+          <w:rFonts w:ascii="Times New Roman" w:hAnsi="Times New Roman" w:cs="Times New Roman"/>
+        </w:rPr>
+        <w:t>  Discusión</w:t>
+      </w:r>
+      <w:proofErr w:type="gramEnd"/>
+      <w:r>
+        <w:rPr>
+          <w:rFonts w:ascii="Times New Roman" w:hAnsi="Times New Roman" w:cs="Times New Roman"/>
+        </w:rPr>
+        <w:t xml:space="preserve"> si </w:t>
+      </w:r>
+      <w:proofErr w:type="spellStart"/>
+      <w:r>
+        <w:rPr>
+          <w:rFonts w:ascii="Times New Roman" w:hAnsi="Times New Roman" w:cs="Times New Roman"/>
+        </w:rPr>
+        <w:t>fire</w:t>
+      </w:r>
+      <w:proofErr w:type="spellEnd"/>
+      <w:r>
+        <w:rPr>
+          <w:rFonts w:ascii="Times New Roman" w:hAnsi="Times New Roman" w:cs="Times New Roman"/>
+        </w:rPr>
+        <w:t xml:space="preserve"> base es la base de datos </w:t>
+      </w:r>
+      <w:proofErr w:type="spellStart"/>
+      <w:r>
+        <w:rPr>
+          <w:rFonts w:ascii="Times New Roman" w:hAnsi="Times New Roman" w:cs="Times New Roman"/>
+        </w:rPr>
+        <w:t>mas</w:t>
+      </w:r>
+      <w:proofErr w:type="spellEnd"/>
+      <w:r>
+        <w:rPr>
+          <w:rFonts w:ascii="Times New Roman" w:hAnsi="Times New Roman" w:cs="Times New Roman"/>
+        </w:rPr>
+        <w:t xml:space="preserve"> conveniente en nuestro proyecto.</w:t>
+      </w:r>
+      <w:r>
+        <w:rPr>
+          <w:rFonts w:ascii="Times New Roman" w:hAnsi="Times New Roman" w:cs="Times New Roman"/>
+        </w:rPr>
+        <w:br/>
+      </w:r>
+      <w:r>
+        <w:rPr>
+          <w:rFonts w:ascii="Times New Roman" w:hAnsi="Times New Roman" w:cs="Times New Roman"/>
+          <w:i/>
+          <w:iCs/>
+        </w:rPr>
+        <w:t>Impedimentos:</w:t>
+      </w:r>
+      <w:r>
+        <w:rPr>
+          <w:rFonts w:ascii="Times New Roman" w:hAnsi="Times New Roman" w:cs="Times New Roman"/>
+        </w:rPr>
+        <w:t> Ninguno.</w:t>
+      </w:r>
+    </w:p>
+    <w:p>
+      <w:pPr>
+        <w:rPr>
+          <w:rFonts w:ascii="Times New Roman" w:hAnsi="Times New Roman" w:cs="Times New Roman"/>
+        </w:rPr>
+      </w:pPr>
+      <w:r>
+        <w:rPr>
+          <w:rFonts w:ascii="Times New Roman" w:hAnsi="Times New Roman" w:cs="Times New Roman"/>
+          <w:b/>
+          <w:bCs/>
+        </w:rPr>
+        <w:t xml:space="preserve">Nikolas H. García </w:t>
+      </w:r>
+      <w:proofErr w:type="gramStart"/>
+      <w:r>
+        <w:rPr>
+          <w:rFonts w:ascii="Times New Roman" w:hAnsi="Times New Roman" w:cs="Times New Roman"/>
+          <w:b/>
+          <w:bCs/>
+        </w:rPr>
+        <w:t>Cure</w:t>
+      </w:r>
+      <w:proofErr w:type="gramEnd"/>
+      <w:r>
+        <w:rPr>
+          <w:rFonts w:ascii="Times New Roman" w:hAnsi="Times New Roman" w:cs="Times New Roman"/>
+          <w:b/>
+          <w:bCs/>
+        </w:rPr>
+        <w:t xml:space="preserve"> (DevOps / </w:t>
+      </w:r>
+      <w:proofErr w:type="spellStart"/>
+      <w:r>
+        <w:rPr>
+          <w:rFonts w:ascii="Times New Roman" w:hAnsi="Times New Roman" w:cs="Times New Roman"/>
+          <w:b/>
+          <w:bCs/>
+        </w:rPr>
+        <w:t>Frontend</w:t>
+      </w:r>
+      <w:proofErr w:type="spellEnd"/>
+      <w:r>
+        <w:rPr>
+          <w:rFonts w:ascii="Times New Roman" w:hAnsi="Times New Roman" w:cs="Times New Roman"/>
+          <w:b/>
+          <w:bCs/>
+        </w:rPr>
+        <w:t>)</w:t>
+      </w:r>
+      <w:r>
+        <w:rPr>
+          <w:rFonts w:ascii="Times New Roman" w:hAnsi="Times New Roman" w:cs="Times New Roman"/>
+        </w:rPr>
+        <w:br/>
+      </w:r>
+      <w:r>
+        <w:rPr>
+          <w:rFonts w:ascii="Times New Roman" w:hAnsi="Times New Roman" w:cs="Times New Roman"/>
+          <w:i/>
+          <w:iCs/>
+        </w:rPr>
+        <w:t>¿Qué hice ayer?:</w:t>
+      </w:r>
+      <w:r>
+        <w:rPr>
+          <w:rFonts w:ascii="Times New Roman" w:hAnsi="Times New Roman" w:cs="Times New Roman"/>
+        </w:rPr>
+        <w:t> revisión general</w:t>
+      </w:r>
+      <w:r>
+        <w:rPr>
+          <w:rFonts w:ascii="Times New Roman" w:hAnsi="Times New Roman" w:cs="Times New Roman"/>
+        </w:rPr>
+        <w:br/>
+      </w:r>
+      <w:r>
+        <w:rPr>
+          <w:rFonts w:ascii="Times New Roman" w:hAnsi="Times New Roman" w:cs="Times New Roman"/>
+          <w:i/>
+          <w:iCs/>
+        </w:rPr>
         <w:t>¿Qué voy a hacer hoy?:</w:t>
       </w:r>
       <w:r>
         <w:rPr>
           <w:rFonts w:ascii="Times New Roman" w:hAnsi="Times New Roman" w:cs="Times New Roman"/>
         </w:rPr>
-        <w:t>  Discusión si fire base es la base de datos mas conveniente en nuestro proyecto.</w:t>
-      </w:r>
-      <w:r>
-        <w:rPr>
-          <w:rFonts w:ascii="Times New Roman" w:hAnsi="Times New Roman" w:cs="Times New Roman"/>
-        </w:rPr>
-        <w:br/>
-      </w:r>
-      <w:r>
-        <w:rPr>
-          <w:rFonts w:ascii="Times New Roman" w:hAnsi="Times New Roman" w:cs="Times New Roman"/>
-          <w:i/>
-          <w:iCs/>
-        </w:rPr>
-        <w:t>Impedimentos:</w:t>
-      </w:r>
-      <w:r>
-        <w:rPr>
-          <w:rFonts w:ascii="Times New Roman" w:hAnsi="Times New Roman" w:cs="Times New Roman"/>
-        </w:rPr>
-        <w:t> Ninguno.</w:t>
-      </w:r>
-    </w:p>
-    <w:p>
-      <w:pPr>
-        <w:rPr>
-          <w:rFonts w:ascii="Times New Roman" w:hAnsi="Times New Roman" w:cs="Times New Roman"/>
-        </w:rPr>
-      </w:pPr>
-      <w:r>
-        <w:rPr>
-          <w:rFonts w:ascii="Times New Roman" w:hAnsi="Times New Roman" w:cs="Times New Roman"/>
-          <w:b/>
-          <w:bCs/>
-        </w:rPr>
-        <w:t>Nikolas H. García Cure (DevOps / Frontend)</w:t>
-      </w:r>
-      <w:r>
-        <w:rPr>
-          <w:rFonts w:ascii="Times New Roman" w:hAnsi="Times New Roman" w:cs="Times New Roman"/>
-        </w:rPr>
-        <w:br/>
-      </w:r>
-      <w:r>
-        <w:rPr>
-          <w:rFonts w:ascii="Times New Roman" w:hAnsi="Times New Roman" w:cs="Times New Roman"/>
-          <w:i/>
-          <w:iCs/>
-        </w:rPr>
-        <w:t>¿Qué hice ayer?:</w:t>
-      </w:r>
-      <w:r>
-        <w:rPr>
-          <w:rFonts w:ascii="Times New Roman" w:hAnsi="Times New Roman" w:cs="Times New Roman"/>
-        </w:rPr>
-        <w:t> revisión general</w:t>
-      </w:r>
-      <w:r>
-        <w:rPr>
-          <w:rFonts w:ascii="Times New Roman" w:hAnsi="Times New Roman" w:cs="Times New Roman"/>
-        </w:rPr>
-        <w:br/>
-      </w:r>
-      <w:r>
-        <w:rPr>
-          <w:rFonts w:ascii="Times New Roman" w:hAnsi="Times New Roman" w:cs="Times New Roman"/>
-          <w:i/>
-          <w:iCs/>
-        </w:rPr>
-        <w:t>¿Qué voy a hacer hoy?:</w:t>
-      </w:r>
-      <w:r>
-        <w:rPr>
-          <w:rFonts w:ascii="Times New Roman" w:hAnsi="Times New Roman" w:cs="Times New Roman"/>
-        </w:rPr>
-        <w:t> Dividir algunas HU épicas en HU mas cortas</w:t>
+        <w:t xml:space="preserve"> Dividir algunas HU épicas en HU </w:t>
+      </w:r>
+      <w:proofErr w:type="spellStart"/>
+      <w:r>
+        <w:rPr>
+          <w:rFonts w:ascii="Times New Roman" w:hAnsi="Times New Roman" w:cs="Times New Roman"/>
+        </w:rPr>
+        <w:t>mas</w:t>
+      </w:r>
+      <w:proofErr w:type="spellEnd"/>
+      <w:r>
+        <w:rPr>
+          <w:rFonts w:ascii="Times New Roman" w:hAnsi="Times New Roman" w:cs="Times New Roman"/>
+        </w:rPr>
+        <w:t xml:space="preserve"> cortas</w:t>
       </w:r>
       <w:r>
         <w:rPr>
@@ -1863,15 +2671,18 @@
           <w:sz w:val="20"/>
           <w:szCs w:val="20"/>
         </w:rPr>
-        <w:t>Notas adicionales</w:t>
-      </w:r>
-      <w:r>
-        <w:rPr>
-          <w:rFonts w:ascii="Times New Roman" w:hAnsi="Times New Roman" w:cs="Times New Roman"/>
+        <w:t xml:space="preserve">Notas </w:t>
+      </w:r>
+      <w:proofErr w:type="gramStart"/>
+      <w:r>
+        <w:rPr>
+          <w:rFonts w:ascii="Times New Roman" w:hAnsi="Times New Roman" w:cs="Times New Roman"/>
+          <w:b/>
+          <w:bCs/>
           <w:sz w:val="20"/>
           <w:szCs w:val="20"/>
         </w:rPr>
-        <w:t xml:space="preserve"> :</w:t>
+        <w:t>adicionales</w:t>
       </w:r>
       <w:r>
         <w:rPr>
@@ -1879,8 +2690,17 @@
           <w:sz w:val="20"/>
           <w:szCs w:val="20"/>
         </w:rPr>
+        <w:t xml:space="preserve"> :</w:t>
+      </w:r>
+      <w:r>
+        <w:rPr>
+          <w:rFonts w:ascii="Times New Roman" w:hAnsi="Times New Roman" w:cs="Times New Roman"/>
+          <w:sz w:val="20"/>
+          <w:szCs w:val="20"/>
+        </w:rPr>
         <w:t>Ninguna</w:t>
       </w:r>
+      <w:proofErr w:type="gramEnd"/>
     </w:p>
     <w:p>
       <w:pPr>
@@ -1889,7 +2709,7 @@
           <w:rFonts w:cs="Times New Roman"/>
         </w:rPr>
       </w:pPr>
-      <w:bookmarkStart w:id="3" w:name="_Toc240287173"/>
+      <w:bookmarkStart w:id="3" w:name="_Toc240394453"/>
       <w:r>
         <w:rPr>
           <w:rFonts w:cs="Times New Roman"/>
@@ -1936,13 +2756,29 @@
           <w:b/>
           <w:bCs/>
         </w:rPr>
-        <w:t>Hora de inicio:</w:t>
-      </w:r>
-      <w:r>
-        <w:rPr>
-          <w:rFonts w:ascii="Times New Roman" w:hAnsi="Times New Roman" w:cs="Times New Roman"/>
-        </w:rPr>
-        <w:t>15:00 | </w:t>
+        <w:t xml:space="preserve">Hora de </w:t>
+      </w:r>
+      <w:proofErr w:type="gramStart"/>
+      <w:r>
+        <w:rPr>
+          <w:rFonts w:ascii="Times New Roman" w:hAnsi="Times New Roman" w:cs="Times New Roman"/>
+          <w:b/>
+          <w:bCs/>
+        </w:rPr>
+        <w:t>inicio:</w:t>
+      </w:r>
+      <w:r>
+        <w:rPr>
+          <w:rFonts w:ascii="Times New Roman" w:hAnsi="Times New Roman" w:cs="Times New Roman"/>
+        </w:rPr>
+        <w:t>15:00</w:t>
+      </w:r>
+      <w:proofErr w:type="gramEnd"/>
+      <w:r>
+        <w:rPr>
+          <w:rFonts w:ascii="Times New Roman" w:hAnsi="Times New Roman" w:cs="Times New Roman"/>
+        </w:rPr>
+        <w:t xml:space="preserve"> | </w:t>
       </w:r>
       <w:r>
         <w:rPr>
@@ -2008,7 +2844,25 @@
           <w:b/>
           <w:bCs/>
         </w:rPr>
-        <w:t>Laura S. Carrero Guevara (Scrum Master / Líder)</w:t>
+        <w:t xml:space="preserve">Laura S. Carrero Guevara (Scrum </w:t>
+      </w:r>
+      <w:proofErr w:type="gramStart"/>
+      <w:r>
+        <w:rPr>
+          <w:rFonts w:ascii="Times New Roman" w:hAnsi="Times New Roman" w:cs="Times New Roman"/>
+          <w:b/>
+          <w:bCs/>
+        </w:rPr>
+        <w:t>Master</w:t>
+      </w:r>
+      <w:proofErr w:type="gramEnd"/>
+      <w:r>
+        <w:rPr>
+          <w:rFonts w:ascii="Times New Roman" w:hAnsi="Times New Roman" w:cs="Times New Roman"/>
+          <w:b/>
+          <w:bCs/>
+        </w:rPr>
+        <w:t xml:space="preserve"> / Líder)</w:t>
       </w:r>
       <w:r>
         <w:rPr>
@@ -2022,19 +2876,196 @@
           <w:i/>
           <w:iCs/>
         </w:rPr>
+        <w:t>¿Qué hice ayer</w:t>
+      </w:r>
+      <w:proofErr w:type="gramStart"/>
+      <w:r>
+        <w:rPr>
+          <w:rFonts w:ascii="Times New Roman" w:hAnsi="Times New Roman" w:cs="Times New Roman"/>
+          <w:i/>
+          <w:iCs/>
+        </w:rPr>
+        <w:t>?:</w:t>
+      </w:r>
+      <w:r>
+        <w:rPr>
+          <w:rFonts w:ascii="Times New Roman" w:hAnsi="Times New Roman" w:cs="Times New Roman"/>
+        </w:rPr>
+        <w:t xml:space="preserve">  </w:t>
+      </w:r>
+      <w:r>
+        <w:rPr>
+          <w:rFonts w:ascii="Times New Roman" w:hAnsi="Times New Roman" w:cs="Times New Roman"/>
+        </w:rPr>
+        <w:t>crear</w:t>
+      </w:r>
+      <w:proofErr w:type="gramEnd"/>
+      <w:r>
+        <w:rPr>
+          <w:rFonts w:ascii="Times New Roman" w:hAnsi="Times New Roman" w:cs="Times New Roman"/>
+        </w:rPr>
+        <w:t xml:space="preserve"> itinerario de actividades </w:t>
+      </w:r>
+      <w:r>
+        <w:rPr>
+          <w:rFonts w:ascii="Times New Roman" w:hAnsi="Times New Roman" w:cs="Times New Roman"/>
+        </w:rPr>
+        <w:br/>
+      </w:r>
+      <w:r>
+        <w:rPr>
+          <w:rFonts w:ascii="Times New Roman" w:hAnsi="Times New Roman" w:cs="Times New Roman"/>
+          <w:i/>
+          <w:iCs/>
+        </w:rPr>
+        <w:t>¿Qué voy a hacer hoy</w:t>
+      </w:r>
+      <w:proofErr w:type="gramStart"/>
+      <w:r>
+        <w:rPr>
+          <w:rFonts w:ascii="Times New Roman" w:hAnsi="Times New Roman" w:cs="Times New Roman"/>
+          <w:i/>
+          <w:iCs/>
+        </w:rPr>
+        <w:t xml:space="preserve">?:  </w:t>
+      </w:r>
+      <w:r>
+        <w:rPr>
+          <w:rFonts w:ascii="Times New Roman" w:hAnsi="Times New Roman" w:cs="Times New Roman"/>
+          <w:i/>
+          <w:iCs/>
+        </w:rPr>
+        <w:t>planear</w:t>
+      </w:r>
+      <w:proofErr w:type="gramEnd"/>
+      <w:r>
+        <w:rPr>
+          <w:rFonts w:ascii="Times New Roman" w:hAnsi="Times New Roman" w:cs="Times New Roman"/>
+          <w:i/>
+          <w:iCs/>
+        </w:rPr>
+        <w:t xml:space="preserve"> el próximo </w:t>
+      </w:r>
+      <w:proofErr w:type="spellStart"/>
+      <w:r>
+        <w:rPr>
+          <w:rFonts w:ascii="Times New Roman" w:hAnsi="Times New Roman" w:cs="Times New Roman"/>
+          <w:i/>
+          <w:iCs/>
+        </w:rPr>
+        <w:t>weekscrum</w:t>
+      </w:r>
+      <w:proofErr w:type="spellEnd"/>
+      <w:r>
+        <w:rPr>
+          <w:rFonts w:ascii="Times New Roman" w:hAnsi="Times New Roman" w:cs="Times New Roman"/>
+        </w:rPr>
+        <w:br/>
+      </w:r>
+      <w:r>
+        <w:rPr>
+          <w:rFonts w:ascii="Times New Roman" w:hAnsi="Times New Roman" w:cs="Times New Roman"/>
+          <w:i/>
+          <w:iCs/>
+        </w:rPr>
+        <w:t>Impedimentos:</w:t>
+      </w:r>
+      <w:r>
+        <w:rPr>
+          <w:rFonts w:ascii="Times New Roman" w:hAnsi="Times New Roman" w:cs="Times New Roman"/>
+        </w:rPr>
+        <w:t> ninguno</w:t>
+      </w:r>
+    </w:p>
+    <w:p>
+      <w:pPr>
+        <w:rPr>
+          <w:rFonts w:ascii="Times New Roman" w:hAnsi="Times New Roman" w:cs="Times New Roman"/>
+        </w:rPr>
+      </w:pPr>
+      <w:r>
+        <w:rPr>
+          <w:rFonts w:ascii="Times New Roman" w:hAnsi="Times New Roman" w:cs="Times New Roman"/>
+          <w:b/>
+          <w:bCs/>
+        </w:rPr>
+        <w:t>Juan F. Chaparro Jurado (</w:t>
+      </w:r>
+      <w:proofErr w:type="spellStart"/>
+      <w:r>
+        <w:rPr>
+          <w:rFonts w:ascii="Times New Roman" w:hAnsi="Times New Roman" w:cs="Times New Roman"/>
+          <w:b/>
+          <w:bCs/>
+        </w:rPr>
+        <w:t>Product</w:t>
+      </w:r>
+      <w:proofErr w:type="spellEnd"/>
+      <w:r>
+        <w:rPr>
+          <w:rFonts w:ascii="Times New Roman" w:hAnsi="Times New Roman" w:cs="Times New Roman"/>
+          <w:b/>
+          <w:bCs/>
+        </w:rPr>
+        <w:t xml:space="preserve"> Owner / </w:t>
+      </w:r>
+      <w:proofErr w:type="spellStart"/>
+      <w:r>
+        <w:rPr>
+          <w:rFonts w:ascii="Times New Roman" w:hAnsi="Times New Roman" w:cs="Times New Roman"/>
+          <w:b/>
+          <w:bCs/>
+        </w:rPr>
+        <w:t>Backend</w:t>
+      </w:r>
+      <w:proofErr w:type="spellEnd"/>
+      <w:r>
+        <w:rPr>
+          <w:rFonts w:ascii="Times New Roman" w:hAnsi="Times New Roman" w:cs="Times New Roman"/>
+          <w:b/>
+          <w:bCs/>
+        </w:rPr>
+        <w:t>)</w:t>
+      </w:r>
+      <w:r>
+        <w:rPr>
+          <w:rFonts w:ascii="Times New Roman" w:hAnsi="Times New Roman" w:cs="Times New Roman"/>
+        </w:rPr>
+        <w:br/>
+      </w:r>
+      <w:r>
+        <w:rPr>
+          <w:rFonts w:ascii="Times New Roman" w:hAnsi="Times New Roman" w:cs="Times New Roman"/>
+          <w:i/>
+          <w:iCs/>
+        </w:rPr>
         <w:t>¿Qué hice ayer?:</w:t>
       </w:r>
       <w:r>
         <w:rPr>
           <w:rFonts w:ascii="Times New Roman" w:hAnsi="Times New Roman" w:cs="Times New Roman"/>
         </w:rPr>
-        <w:t xml:space="preserve">  </w:t>
-      </w:r>
-      <w:r>
-        <w:rPr>
-          <w:rFonts w:ascii="Times New Roman" w:hAnsi="Times New Roman" w:cs="Times New Roman"/>
-        </w:rPr>
-        <w:t xml:space="preserve">crear itinerario de actividades </w:t>
+        <w:t> </w:t>
+      </w:r>
+      <w:r>
+        <w:rPr>
+          <w:rFonts w:ascii="Times New Roman" w:hAnsi="Times New Roman" w:cs="Times New Roman"/>
+        </w:rPr>
+        <w:t xml:space="preserve">dividir las HU épicas en HU </w:t>
+      </w:r>
+      <w:proofErr w:type="spellStart"/>
+      <w:r>
+        <w:rPr>
+          <w:rFonts w:ascii="Times New Roman" w:hAnsi="Times New Roman" w:cs="Times New Roman"/>
+        </w:rPr>
+        <w:t>mas</w:t>
+      </w:r>
+      <w:proofErr w:type="spellEnd"/>
+      <w:r>
+        <w:rPr>
+          <w:rFonts w:ascii="Times New Roman" w:hAnsi="Times New Roman" w:cs="Times New Roman"/>
+        </w:rPr>
+        <w:t xml:space="preserve"> pequeñas</w:t>
       </w:r>
       <w:r>
         <w:rPr>
@@ -2048,15 +3079,25 @@
           <w:i/>
           <w:iCs/>
         </w:rPr>
-        <w:t xml:space="preserve">¿Qué voy a hacer hoy?:  </w:t>
-      </w:r>
-      <w:r>
-        <w:rPr>
-          <w:rFonts w:ascii="Times New Roman" w:hAnsi="Times New Roman" w:cs="Times New Roman"/>
-          <w:i/>
-          <w:iCs/>
-        </w:rPr>
-        <w:t>planear el próximo weekscrum</w:t>
+        <w:t>¿Qué voy a hacer hoy?:</w:t>
+      </w:r>
+      <w:r>
+        <w:rPr>
+          <w:rFonts w:ascii="Times New Roman" w:hAnsi="Times New Roman" w:cs="Times New Roman"/>
+        </w:rPr>
+        <w:t> </w:t>
+      </w:r>
+      <w:r>
+        <w:rPr>
+          <w:rFonts w:ascii="Times New Roman" w:hAnsi="Times New Roman" w:cs="Times New Roman"/>
+        </w:rPr>
+        <w:t>Complementar algunas HU</w:t>
+      </w:r>
+      <w:r>
+        <w:rPr>
+          <w:rFonts w:ascii="Times New Roman" w:hAnsi="Times New Roman" w:cs="Times New Roman"/>
+        </w:rPr>
+        <w:t xml:space="preserve"> </w:t>
       </w:r>
       <w:r>
         <w:rPr>
@@ -2076,22 +3117,22 @@
         <w:rPr>
           <w:rFonts w:ascii="Times New Roman" w:hAnsi="Times New Roman" w:cs="Times New Roman"/>
         </w:rPr>
-        <w:t> ninguno</w:t>
-      </w:r>
-    </w:p>
-    <w:p>
-      <w:pPr>
-        <w:rPr>
-          <w:rFonts w:ascii="Times New Roman" w:hAnsi="Times New Roman" w:cs="Times New Roman"/>
-        </w:rPr>
-      </w:pPr>
-      <w:r>
-        <w:rPr>
-          <w:rFonts w:ascii="Times New Roman" w:hAnsi="Times New Roman" w:cs="Times New Roman"/>
-          <w:b/>
-          <w:bCs/>
-        </w:rPr>
-        <w:t>Juan F. Chaparro Jurado (Product Owner / Backend)</w:t>
+        <w:t> Ninguno.</w:t>
+      </w:r>
+    </w:p>
+    <w:p>
+      <w:pPr>
+        <w:rPr>
+          <w:rFonts w:ascii="Times New Roman" w:hAnsi="Times New Roman" w:cs="Times New Roman"/>
+        </w:rPr>
+      </w:pPr>
+      <w:r>
+        <w:rPr>
+          <w:rFonts w:ascii="Times New Roman" w:hAnsi="Times New Roman" w:cs="Times New Roman"/>
+          <w:b/>
+          <w:bCs/>
+        </w:rPr>
+        <w:t>Daniel M. Plazas López (Sprint Planner / QA / Base de Datos)</w:t>
       </w:r>
       <w:r>
         <w:rPr>
@@ -2117,7 +3158,21 @@
         <w:rPr>
           <w:rFonts w:ascii="Times New Roman" w:hAnsi="Times New Roman" w:cs="Times New Roman"/>
         </w:rPr>
-        <w:t>dividir las HU épicas en HU mas pequeñas</w:t>
+        <w:t xml:space="preserve">planeación de </w:t>
+      </w:r>
+      <w:proofErr w:type="spellStart"/>
+      <w:r>
+        <w:rPr>
+          <w:rFonts w:ascii="Times New Roman" w:hAnsi="Times New Roman" w:cs="Times New Roman"/>
+        </w:rPr>
+        <w:t>como</w:t>
+      </w:r>
+      <w:proofErr w:type="spellEnd"/>
+      <w:r>
+        <w:rPr>
+          <w:rFonts w:ascii="Times New Roman" w:hAnsi="Times New Roman" w:cs="Times New Roman"/>
+        </w:rPr>
+        <w:t xml:space="preserve"> aplicar la base de datos al proyecto</w:t>
       </w:r>
       <w:r>
         <w:rPr>
@@ -2137,13 +3192,209 @@
         <w:rPr>
           <w:rFonts w:ascii="Times New Roman" w:hAnsi="Times New Roman" w:cs="Times New Roman"/>
         </w:rPr>
+        <w:t xml:space="preserve"> buscar cual es la base de </w:t>
+      </w:r>
+      <w:proofErr w:type="gramStart"/>
+      <w:r>
+        <w:rPr>
+          <w:rFonts w:ascii="Times New Roman" w:hAnsi="Times New Roman" w:cs="Times New Roman"/>
+        </w:rPr>
+        <w:t>datos  que</w:t>
+      </w:r>
+      <w:proofErr w:type="gramEnd"/>
+      <w:r>
+        <w:rPr>
+          <w:rFonts w:ascii="Times New Roman" w:hAnsi="Times New Roman" w:cs="Times New Roman"/>
+        </w:rPr>
+        <w:t xml:space="preserve"> se usara en el proyecto</w:t>
+      </w:r>
+      <w:r>
+        <w:rPr>
+          <w:rFonts w:ascii="Times New Roman" w:hAnsi="Times New Roman" w:cs="Times New Roman"/>
+        </w:rPr>
+        <w:br/>
+      </w:r>
+      <w:r>
+        <w:rPr>
+          <w:rFonts w:ascii="Times New Roman" w:hAnsi="Times New Roman" w:cs="Times New Roman"/>
+          <w:i/>
+          <w:iCs/>
+        </w:rPr>
+        <w:t>Impedimentos:</w:t>
+      </w:r>
+      <w:r>
+        <w:rPr>
+          <w:rFonts w:ascii="Times New Roman" w:hAnsi="Times New Roman" w:cs="Times New Roman"/>
+        </w:rPr>
+        <w:t> Ninguno.</w:t>
+      </w:r>
+    </w:p>
+    <w:p>
+      <w:pPr>
+        <w:rPr>
+          <w:rFonts w:ascii="Times New Roman" w:hAnsi="Times New Roman" w:cs="Times New Roman"/>
+        </w:rPr>
+      </w:pPr>
+      <w:r>
+        <w:rPr>
+          <w:rFonts w:ascii="Times New Roman" w:hAnsi="Times New Roman" w:cs="Times New Roman"/>
+          <w:b/>
+          <w:bCs/>
+        </w:rPr>
+        <w:t xml:space="preserve">Nikolas H. García </w:t>
+      </w:r>
+      <w:proofErr w:type="gramStart"/>
+      <w:r>
+        <w:rPr>
+          <w:rFonts w:ascii="Times New Roman" w:hAnsi="Times New Roman" w:cs="Times New Roman"/>
+          <w:b/>
+          <w:bCs/>
+        </w:rPr>
+        <w:t>Cure</w:t>
+      </w:r>
+      <w:proofErr w:type="gramEnd"/>
+      <w:r>
+        <w:rPr>
+          <w:rFonts w:ascii="Times New Roman" w:hAnsi="Times New Roman" w:cs="Times New Roman"/>
+          <w:b/>
+          <w:bCs/>
+        </w:rPr>
+        <w:t xml:space="preserve"> (DevOps / </w:t>
+      </w:r>
+      <w:proofErr w:type="spellStart"/>
+      <w:r>
+        <w:rPr>
+          <w:rFonts w:ascii="Times New Roman" w:hAnsi="Times New Roman" w:cs="Times New Roman"/>
+          <w:b/>
+          <w:bCs/>
+        </w:rPr>
+        <w:t>Frontend</w:t>
+      </w:r>
+      <w:proofErr w:type="spellEnd"/>
+      <w:r>
+        <w:rPr>
+          <w:rFonts w:ascii="Times New Roman" w:hAnsi="Times New Roman" w:cs="Times New Roman"/>
+          <w:b/>
+          <w:bCs/>
+        </w:rPr>
+        <w:t>)</w:t>
+      </w:r>
+      <w:r>
+        <w:rPr>
+          <w:rFonts w:ascii="Times New Roman" w:hAnsi="Times New Roman" w:cs="Times New Roman"/>
+        </w:rPr>
+        <w:br/>
+      </w:r>
+      <w:r>
+        <w:rPr>
+          <w:rFonts w:ascii="Times New Roman" w:hAnsi="Times New Roman" w:cs="Times New Roman"/>
+          <w:i/>
+          <w:iCs/>
+        </w:rPr>
+        <w:t>¿Qué hice ayer?:</w:t>
+      </w:r>
+      <w:r>
+        <w:rPr>
+          <w:rFonts w:ascii="Times New Roman" w:hAnsi="Times New Roman" w:cs="Times New Roman"/>
+        </w:rPr>
         <w:t> </w:t>
       </w:r>
       <w:r>
         <w:rPr>
           <w:rFonts w:ascii="Times New Roman" w:hAnsi="Times New Roman" w:cs="Times New Roman"/>
         </w:rPr>
-        <w:t>Complementar algunas HU</w:t>
+        <w:t xml:space="preserve">dividir las HU épicas en HU </w:t>
+      </w:r>
+      <w:proofErr w:type="spellStart"/>
+      <w:r>
+        <w:rPr>
+          <w:rFonts w:ascii="Times New Roman" w:hAnsi="Times New Roman" w:cs="Times New Roman"/>
+        </w:rPr>
+        <w:t>mas</w:t>
+      </w:r>
+      <w:proofErr w:type="spellEnd"/>
+      <w:r>
+        <w:rPr>
+          <w:rFonts w:ascii="Times New Roman" w:hAnsi="Times New Roman" w:cs="Times New Roman"/>
+        </w:rPr>
+        <w:t xml:space="preserve"> pequeñas</w:t>
+      </w:r>
+      <w:r>
+        <w:rPr>
+          <w:rFonts w:ascii="Times New Roman" w:hAnsi="Times New Roman" w:cs="Times New Roman"/>
+        </w:rPr>
+        <w:br/>
+      </w:r>
+      <w:r>
+        <w:rPr>
+          <w:rFonts w:ascii="Times New Roman" w:hAnsi="Times New Roman" w:cs="Times New Roman"/>
+          <w:i/>
+          <w:iCs/>
+        </w:rPr>
+        <w:t>¿Qué voy a hacer hoy?:</w:t>
+      </w:r>
+      <w:r>
+        <w:rPr>
+          <w:rFonts w:ascii="Times New Roman" w:hAnsi="Times New Roman" w:cs="Times New Roman"/>
+        </w:rPr>
+        <w:t> </w:t>
+      </w:r>
+      <w:proofErr w:type="gramStart"/>
+      <w:r>
+        <w:rPr>
+          <w:rFonts w:ascii="Times New Roman" w:hAnsi="Times New Roman" w:cs="Times New Roman"/>
+        </w:rPr>
+        <w:t>Complementar  algunas</w:t>
+      </w:r>
+      <w:proofErr w:type="gramEnd"/>
+      <w:r>
+        <w:rPr>
+          <w:rFonts w:ascii="Times New Roman" w:hAnsi="Times New Roman" w:cs="Times New Roman"/>
+        </w:rPr>
+        <w:t xml:space="preserve"> HU.</w:t>
+      </w:r>
+      <w:r>
+        <w:rPr>
+          <w:rFonts w:ascii="Times New Roman" w:hAnsi="Times New Roman" w:cs="Times New Roman"/>
+        </w:rPr>
+        <w:br/>
+      </w:r>
+      <w:r>
+        <w:rPr>
+          <w:rFonts w:ascii="Times New Roman" w:hAnsi="Times New Roman" w:cs="Times New Roman"/>
+          <w:i/>
+          <w:iCs/>
+        </w:rPr>
+        <w:t>Impedimentos:</w:t>
+      </w:r>
+      <w:r>
+        <w:rPr>
+          <w:rFonts w:ascii="Times New Roman" w:hAnsi="Times New Roman" w:cs="Times New Roman"/>
+        </w:rPr>
+        <w:t> ninguno.</w:t>
+      </w:r>
+    </w:p>
+    <w:p>
+      <w:pPr>
+        <w:rPr>
+          <w:rFonts w:ascii="Times New Roman" w:hAnsi="Times New Roman" w:cs="Times New Roman"/>
+        </w:rPr>
+      </w:pPr>
+      <w:r>
+        <w:rPr>
+          <w:rFonts w:ascii="Times New Roman" w:hAnsi="Times New Roman" w:cs="Times New Roman"/>
+          <w:b/>
+          <w:bCs/>
+        </w:rPr>
+        <w:t>Notas adicionales</w:t>
+      </w:r>
+      <w:r>
+        <w:rPr>
+          <w:rFonts w:ascii="Times New Roman" w:hAnsi="Times New Roman" w:cs="Times New Roman"/>
+          <w:b/>
+          <w:bCs/>
+        </w:rPr>
+        <w:t>:</w:t>
       </w:r>
       <w:r>
         <w:rPr>
@@ -2155,223 +3406,6 @@
         <w:rPr>
           <w:rFonts w:ascii="Times New Roman" w:hAnsi="Times New Roman" w:cs="Times New Roman"/>
         </w:rPr>
-        <w:br/>
-      </w:r>
-      <w:r>
-        <w:rPr>
-          <w:rFonts w:ascii="Times New Roman" w:hAnsi="Times New Roman" w:cs="Times New Roman"/>
-          <w:i/>
-          <w:iCs/>
-        </w:rPr>
-        <w:t>Impedimentos:</w:t>
-      </w:r>
-      <w:r>
-        <w:rPr>
-          <w:rFonts w:ascii="Times New Roman" w:hAnsi="Times New Roman" w:cs="Times New Roman"/>
-        </w:rPr>
-        <w:t> Ninguno.</w:t>
-      </w:r>
-    </w:p>
-    <w:p>
-      <w:pPr>
-        <w:rPr>
-          <w:rFonts w:ascii="Times New Roman" w:hAnsi="Times New Roman" w:cs="Times New Roman"/>
-        </w:rPr>
-      </w:pPr>
-      <w:r>
-        <w:rPr>
-          <w:rFonts w:ascii="Times New Roman" w:hAnsi="Times New Roman" w:cs="Times New Roman"/>
-          <w:b/>
-          <w:bCs/>
-        </w:rPr>
-        <w:t>Daniel M. Plazas López (Sprint Planner / QA / Base de Datos)</w:t>
-      </w:r>
-      <w:r>
-        <w:rPr>
-          <w:rFonts w:ascii="Times New Roman" w:hAnsi="Times New Roman" w:cs="Times New Roman"/>
-        </w:rPr>
-        <w:br/>
-      </w:r>
-      <w:r>
-        <w:rPr>
-          <w:rFonts w:ascii="Times New Roman" w:hAnsi="Times New Roman" w:cs="Times New Roman"/>
-          <w:i/>
-          <w:iCs/>
-        </w:rPr>
-        <w:t>¿Qué hice ayer?:</w:t>
-      </w:r>
-      <w:r>
-        <w:rPr>
-          <w:rFonts w:ascii="Times New Roman" w:hAnsi="Times New Roman" w:cs="Times New Roman"/>
-        </w:rPr>
-        <w:t> </w:t>
-      </w:r>
-      <w:r>
-        <w:rPr>
-          <w:rFonts w:ascii="Times New Roman" w:hAnsi="Times New Roman" w:cs="Times New Roman"/>
-        </w:rPr>
-        <w:t>planeación de como aplicar la base de datos al proyecto</w:t>
-      </w:r>
-      <w:r>
-        <w:rPr>
-          <w:rFonts w:ascii="Times New Roman" w:hAnsi="Times New Roman" w:cs="Times New Roman"/>
-        </w:rPr>
-        <w:br/>
-      </w:r>
-      <w:r>
-        <w:rPr>
-          <w:rFonts w:ascii="Times New Roman" w:hAnsi="Times New Roman" w:cs="Times New Roman"/>
-          <w:i/>
-          <w:iCs/>
-        </w:rPr>
-        <w:t>¿Qué voy a hacer hoy?:</w:t>
-      </w:r>
-      <w:r>
-        <w:rPr>
-          <w:rFonts w:ascii="Times New Roman" w:hAnsi="Times New Roman" w:cs="Times New Roman"/>
-        </w:rPr>
-        <w:t> buscar cual es la base de datos  que se usara en el proyecto</w:t>
-      </w:r>
-      <w:r>
-        <w:rPr>
-          <w:rFonts w:ascii="Times New Roman" w:hAnsi="Times New Roman" w:cs="Times New Roman"/>
-        </w:rPr>
-        <w:br/>
-      </w:r>
-      <w:r>
-        <w:rPr>
-          <w:rFonts w:ascii="Times New Roman" w:hAnsi="Times New Roman" w:cs="Times New Roman"/>
-          <w:i/>
-          <w:iCs/>
-        </w:rPr>
-        <w:t>Impedimentos:</w:t>
-      </w:r>
-      <w:r>
-        <w:rPr>
-          <w:rFonts w:ascii="Times New Roman" w:hAnsi="Times New Roman" w:cs="Times New Roman"/>
-        </w:rPr>
-        <w:t> Ninguno.</w:t>
-      </w:r>
-    </w:p>
-    <w:p>
-      <w:pPr>
-        <w:rPr>
-          <w:rFonts w:ascii="Times New Roman" w:hAnsi="Times New Roman" w:cs="Times New Roman"/>
-        </w:rPr>
-      </w:pPr>
-      <w:r>
-        <w:rPr>
-          <w:rFonts w:ascii="Times New Roman" w:hAnsi="Times New Roman" w:cs="Times New Roman"/>
-          <w:b/>
-          <w:bCs/>
-        </w:rPr>
-        <w:t>Nikolas H. García Cure (DevOps / Frontend)</w:t>
-      </w:r>
-      <w:r>
-        <w:rPr>
-          <w:rFonts w:ascii="Times New Roman" w:hAnsi="Times New Roman" w:cs="Times New Roman"/>
-        </w:rPr>
-        <w:br/>
-      </w:r>
-      <w:r>
-        <w:rPr>
-          <w:rFonts w:ascii="Times New Roman" w:hAnsi="Times New Roman" w:cs="Times New Roman"/>
-          <w:i/>
-          <w:iCs/>
-        </w:rPr>
-        <w:t>¿Qué hice ayer?:</w:t>
-      </w:r>
-      <w:r>
-        <w:rPr>
-          <w:rFonts w:ascii="Times New Roman" w:hAnsi="Times New Roman" w:cs="Times New Roman"/>
-        </w:rPr>
-        <w:t> </w:t>
-      </w:r>
-      <w:r>
-        <w:rPr>
-          <w:rFonts w:ascii="Times New Roman" w:hAnsi="Times New Roman" w:cs="Times New Roman"/>
-        </w:rPr>
-        <w:t>dividir las HU épicas en HU mas pequeñas</w:t>
-      </w:r>
-      <w:r>
-        <w:rPr>
-          <w:rFonts w:ascii="Times New Roman" w:hAnsi="Times New Roman" w:cs="Times New Roman"/>
-        </w:rPr>
-        <w:br/>
-      </w:r>
-      <w:r>
-        <w:rPr>
-          <w:rFonts w:ascii="Times New Roman" w:hAnsi="Times New Roman" w:cs="Times New Roman"/>
-          <w:i/>
-          <w:iCs/>
-        </w:rPr>
-        <w:t>¿Qué voy a hacer hoy?:</w:t>
-      </w:r>
-      <w:r>
-        <w:rPr>
-          <w:rFonts w:ascii="Times New Roman" w:hAnsi="Times New Roman" w:cs="Times New Roman"/>
-        </w:rPr>
-        <w:t> </w:t>
-      </w:r>
-      <w:r>
-        <w:rPr>
-          <w:rFonts w:ascii="Times New Roman" w:hAnsi="Times New Roman" w:cs="Times New Roman"/>
-        </w:rPr>
-        <w:t>Complementar  algunas HU.</w:t>
-      </w:r>
-      <w:r>
-        <w:rPr>
-          <w:rFonts w:ascii="Times New Roman" w:hAnsi="Times New Roman" w:cs="Times New Roman"/>
-        </w:rPr>
-        <w:br/>
-      </w:r>
-      <w:r>
-        <w:rPr>
-          <w:rFonts w:ascii="Times New Roman" w:hAnsi="Times New Roman" w:cs="Times New Roman"/>
-          <w:i/>
-          <w:iCs/>
-        </w:rPr>
-        <w:t>Impedimentos:</w:t>
-      </w:r>
-      <w:r>
-        <w:rPr>
-          <w:rFonts w:ascii="Times New Roman" w:hAnsi="Times New Roman" w:cs="Times New Roman"/>
-        </w:rPr>
-        <w:t> ninguno.</w:t>
-      </w:r>
-    </w:p>
-    <w:p>
-      <w:pPr>
-        <w:rPr>
-          <w:rFonts w:ascii="Times New Roman" w:hAnsi="Times New Roman" w:cs="Times New Roman"/>
-        </w:rPr>
-      </w:pPr>
-      <w:r>
-        <w:rPr>
-          <w:rFonts w:ascii="Times New Roman" w:hAnsi="Times New Roman" w:cs="Times New Roman"/>
-          <w:b/>
-          <w:bCs/>
-        </w:rPr>
-        <w:t>Notas adicionales</w:t>
-      </w:r>
-      <w:r>
-        <w:rPr>
-          <w:rFonts w:ascii="Times New Roman" w:hAnsi="Times New Roman" w:cs="Times New Roman"/>
-          <w:b/>
-          <w:bCs/>
-        </w:rPr>
-        <w:t>:</w:t>
-      </w:r>
-      <w:r>
-        <w:rPr>
-          <w:rFonts w:ascii="Times New Roman" w:hAnsi="Times New Roman" w:cs="Times New Roman"/>
-        </w:rPr>
-        <w:t xml:space="preserve"> </w:t>
-      </w:r>
-      <w:r>
-        <w:rPr>
-          <w:rFonts w:ascii="Times New Roman" w:hAnsi="Times New Roman" w:cs="Times New Roman"/>
-        </w:rPr>
         <w:t>Ninguna</w:t>
       </w:r>
     </w:p>
@@ -2382,7 +3416,7 @@
           <w:rFonts w:cs="Times New Roman"/>
         </w:rPr>
       </w:pPr>
-      <w:bookmarkStart w:id="4" w:name="_Toc240287174"/>
+      <w:bookmarkStart w:id="4" w:name="_Toc240394454"/>
       <w:r>
         <w:rPr>
           <w:rFonts w:cs="Times New Roman"/>
@@ -2429,13 +3463,29 @@
           <w:b/>
           <w:bCs/>
         </w:rPr>
-        <w:t>Hora de inicio:</w:t>
-      </w:r>
-      <w:r>
-        <w:rPr>
-          <w:rFonts w:ascii="Times New Roman" w:hAnsi="Times New Roman" w:cs="Times New Roman"/>
-        </w:rPr>
-        <w:t>15:00 | </w:t>
+        <w:t xml:space="preserve">Hora de </w:t>
+      </w:r>
+      <w:proofErr w:type="gramStart"/>
+      <w:r>
+        <w:rPr>
+          <w:rFonts w:ascii="Times New Roman" w:hAnsi="Times New Roman" w:cs="Times New Roman"/>
+          <w:b/>
+          <w:bCs/>
+        </w:rPr>
+        <w:t>inicio:</w:t>
+      </w:r>
+      <w:r>
+        <w:rPr>
+          <w:rFonts w:ascii="Times New Roman" w:hAnsi="Times New Roman" w:cs="Times New Roman"/>
+        </w:rPr>
+        <w:t>15:00</w:t>
+      </w:r>
+      <w:proofErr w:type="gramEnd"/>
+      <w:r>
+        <w:rPr>
+          <w:rFonts w:ascii="Times New Roman" w:hAnsi="Times New Roman" w:cs="Times New Roman"/>
+        </w:rPr>
+        <w:t xml:space="preserve"> | </w:t>
       </w:r>
       <w:r>
         <w:rPr>
@@ -2501,7 +3551,25 @@
           <w:b/>
           <w:bCs/>
         </w:rPr>
-        <w:t>Laura S. Carrero Guevara (Scrum Master / Líder)</w:t>
+        <w:t xml:space="preserve">Laura S. Carrero Guevara (Scrum </w:t>
+      </w:r>
+      <w:proofErr w:type="gramStart"/>
+      <w:r>
+        <w:rPr>
+          <w:rFonts w:ascii="Times New Roman" w:hAnsi="Times New Roman" w:cs="Times New Roman"/>
+          <w:b/>
+          <w:bCs/>
+        </w:rPr>
+        <w:t>Master</w:t>
+      </w:r>
+      <w:proofErr w:type="gramEnd"/>
+      <w:r>
+        <w:rPr>
+          <w:rFonts w:ascii="Times New Roman" w:hAnsi="Times New Roman" w:cs="Times New Roman"/>
+          <w:b/>
+          <w:bCs/>
+        </w:rPr>
+        <w:t xml:space="preserve"> / Líder)</w:t>
       </w:r>
       <w:r>
         <w:rPr>
@@ -2529,8 +3597,18 @@
           <w:i/>
           <w:iCs/>
         </w:rPr>
-        <w:t>planear el próximo weekscrum</w:t>
-      </w:r>
+        <w:t xml:space="preserve">planear el próximo </w:t>
+      </w:r>
+      <w:proofErr w:type="spellStart"/>
+      <w:r>
+        <w:rPr>
+          <w:rFonts w:ascii="Times New Roman" w:hAnsi="Times New Roman" w:cs="Times New Roman"/>
+          <w:i/>
+          <w:iCs/>
+        </w:rPr>
+        <w:t>weekscrum</w:t>
+      </w:r>
+      <w:proofErr w:type="spellEnd"/>
       <w:r>
         <w:rPr>
           <w:rFonts w:ascii="Times New Roman" w:hAnsi="Times New Roman" w:cs="Times New Roman"/>
@@ -2543,15 +3621,33 @@
           <w:i/>
           <w:iCs/>
         </w:rPr>
-        <w:t xml:space="preserve">¿Qué voy a hacer hoy?:  </w:t>
-      </w:r>
-      <w:r>
-        <w:rPr>
-          <w:rFonts w:ascii="Times New Roman" w:hAnsi="Times New Roman" w:cs="Times New Roman"/>
-          <w:i/>
-          <w:iCs/>
-        </w:rPr>
-        <w:t>Ayudar a ponerle el tamaño y prioridad a cada HU</w:t>
+        <w:t>¿Qué voy a hacer hoy</w:t>
+      </w:r>
+      <w:proofErr w:type="gramStart"/>
+      <w:r>
+        <w:rPr>
+          <w:rFonts w:ascii="Times New Roman" w:hAnsi="Times New Roman" w:cs="Times New Roman"/>
+          <w:i/>
+          <w:iCs/>
+        </w:rPr>
+        <w:t xml:space="preserve">?:  </w:t>
+      </w:r>
+      <w:r>
+        <w:rPr>
+          <w:rFonts w:ascii="Times New Roman" w:hAnsi="Times New Roman" w:cs="Times New Roman"/>
+          <w:i/>
+          <w:iCs/>
+        </w:rPr>
+        <w:t>Ayudar</w:t>
+      </w:r>
+      <w:proofErr w:type="gramEnd"/>
+      <w:r>
+        <w:rPr>
+          <w:rFonts w:ascii="Times New Roman" w:hAnsi="Times New Roman" w:cs="Times New Roman"/>
+          <w:i/>
+          <w:iCs/>
+        </w:rPr>
+        <w:t xml:space="preserve"> a ponerle el tamaño y prioridad a cada HU</w:t>
       </w:r>
       <w:r>
         <w:rPr>
@@ -2592,7 +3688,43 @@
           <w:b/>
           <w:bCs/>
         </w:rPr>
-        <w:t>Juan F. Chaparro Jurado (Product Owner / Backend)</w:t>
+        <w:t>Juan F. Chaparro Jurado (</w:t>
+      </w:r>
+      <w:proofErr w:type="spellStart"/>
+      <w:r>
+        <w:rPr>
+          <w:rFonts w:ascii="Times New Roman" w:hAnsi="Times New Roman" w:cs="Times New Roman"/>
+          <w:b/>
+          <w:bCs/>
+        </w:rPr>
+        <w:t>Product</w:t>
+      </w:r>
+      <w:proofErr w:type="spellEnd"/>
+      <w:r>
+        <w:rPr>
+          <w:rFonts w:ascii="Times New Roman" w:hAnsi="Times New Roman" w:cs="Times New Roman"/>
+          <w:b/>
+          <w:bCs/>
+        </w:rPr>
+        <w:t xml:space="preserve"> Owner / </w:t>
+      </w:r>
+      <w:proofErr w:type="spellStart"/>
+      <w:r>
+        <w:rPr>
+          <w:rFonts w:ascii="Times New Roman" w:hAnsi="Times New Roman" w:cs="Times New Roman"/>
+          <w:b/>
+          <w:bCs/>
+        </w:rPr>
+        <w:t>Backend</w:t>
+      </w:r>
+      <w:proofErr w:type="spellEnd"/>
+      <w:r>
+        <w:rPr>
+          <w:rFonts w:ascii="Times New Roman" w:hAnsi="Times New Roman" w:cs="Times New Roman"/>
+          <w:b/>
+          <w:bCs/>
+        </w:rPr>
+        <w:t>)</w:t>
       </w:r>
       <w:r>
         <w:rPr>
@@ -2644,8 +3776,30 @@
         <w:rPr>
           <w:rFonts w:ascii="Times New Roman" w:hAnsi="Times New Roman" w:cs="Times New Roman"/>
         </w:rPr>
-        <w:t>ver la posibles aplicaciones del backend</w:t>
-      </w:r>
+        <w:t xml:space="preserve">ver </w:t>
+      </w:r>
+      <w:proofErr w:type="gramStart"/>
+      <w:r>
+        <w:rPr>
+          <w:rFonts w:ascii="Times New Roman" w:hAnsi="Times New Roman" w:cs="Times New Roman"/>
+        </w:rPr>
+        <w:t>la posibles aplicaciones</w:t>
+      </w:r>
+      <w:proofErr w:type="gramEnd"/>
+      <w:r>
+        <w:rPr>
+          <w:rFonts w:ascii="Times New Roman" w:hAnsi="Times New Roman" w:cs="Times New Roman"/>
+        </w:rPr>
+        <w:t xml:space="preserve"> del </w:t>
+      </w:r>
+      <w:proofErr w:type="spellStart"/>
+      <w:r>
+        <w:rPr>
+          <w:rFonts w:ascii="Times New Roman" w:hAnsi="Times New Roman" w:cs="Times New Roman"/>
+        </w:rPr>
+        <w:t>backend</w:t>
+      </w:r>
+      <w:proofErr w:type="spellEnd"/>
       <w:r>
         <w:rPr>
           <w:rFonts w:ascii="Times New Roman" w:hAnsi="Times New Roman" w:cs="Times New Roman"/>
@@ -2711,7 +3865,21 @@
         <w:rPr>
           <w:rFonts w:ascii="Times New Roman" w:hAnsi="Times New Roman" w:cs="Times New Roman"/>
         </w:rPr>
-        <w:t>planeación de como aplicar la base de datos al proyecto</w:t>
+        <w:t xml:space="preserve">planeación de </w:t>
+      </w:r>
+      <w:proofErr w:type="spellStart"/>
+      <w:r>
+        <w:rPr>
+          <w:rFonts w:ascii="Times New Roman" w:hAnsi="Times New Roman" w:cs="Times New Roman"/>
+        </w:rPr>
+        <w:t>como</w:t>
+      </w:r>
+      <w:proofErr w:type="spellEnd"/>
+      <w:r>
+        <w:rPr>
+          <w:rFonts w:ascii="Times New Roman" w:hAnsi="Times New Roman" w:cs="Times New Roman"/>
+        </w:rPr>
+        <w:t xml:space="preserve"> aplicar la base de datos al proyecto</w:t>
       </w:r>
       <w:r>
         <w:rPr>
@@ -2731,7 +3899,19 @@
         <w:rPr>
           <w:rFonts w:ascii="Times New Roman" w:hAnsi="Times New Roman" w:cs="Times New Roman"/>
         </w:rPr>
-        <w:t> buscar cual es la base de datos  que se usara en el proyecto</w:t>
+        <w:t> </w:t>
+      </w:r>
+      <w:r>
+        <w:rPr>
+          <w:rFonts w:ascii="Times New Roman" w:hAnsi="Times New Roman" w:cs="Times New Roman"/>
+        </w:rPr>
+        <w:t>crear los casos de uso</w:t>
+      </w:r>
+      <w:r>
+        <w:rPr>
+          <w:rFonts w:ascii="Times New Roman" w:hAnsi="Times New Roman" w:cs="Times New Roman"/>
+        </w:rPr>
+        <w:t xml:space="preserve"> </w:t>
       </w:r>
       <w:r>
         <w:rPr>
@@ -2766,7 +3946,43 @@
           <w:b/>
           <w:bCs/>
         </w:rPr>
-        <w:t>Nikolas H. García Cure (DevOps / Frontend)</w:t>
+        <w:t xml:space="preserve">Nikolas H. García </w:t>
+      </w:r>
+      <w:proofErr w:type="gramStart"/>
+      <w:r>
+        <w:rPr>
+          <w:rFonts w:ascii="Times New Roman" w:hAnsi="Times New Roman" w:cs="Times New Roman"/>
+          <w:b/>
+          <w:bCs/>
+        </w:rPr>
+        <w:t>Cure</w:t>
+      </w:r>
+      <w:proofErr w:type="gramEnd"/>
+      <w:r>
+        <w:rPr>
+          <w:rFonts w:ascii="Times New Roman" w:hAnsi="Times New Roman" w:cs="Times New Roman"/>
+          <w:b/>
+          <w:bCs/>
+        </w:rPr>
+        <w:t xml:space="preserve"> (DevOps / </w:t>
+      </w:r>
+      <w:proofErr w:type="spellStart"/>
+      <w:r>
+        <w:rPr>
+          <w:rFonts w:ascii="Times New Roman" w:hAnsi="Times New Roman" w:cs="Times New Roman"/>
+          <w:b/>
+          <w:bCs/>
+        </w:rPr>
+        <w:t>Frontend</w:t>
+      </w:r>
+      <w:proofErr w:type="spellEnd"/>
+      <w:r>
+        <w:rPr>
+          <w:rFonts w:ascii="Times New Roman" w:hAnsi="Times New Roman" w:cs="Times New Roman"/>
+          <w:b/>
+          <w:bCs/>
+        </w:rPr>
+        <w:t>)</w:t>
       </w:r>
       <w:r>
         <w:rPr>
@@ -2788,11 +4004,19 @@
         </w:rPr>
         <w:t xml:space="preserve"> </w:t>
       </w:r>
-      <w:r>
-        <w:rPr>
-          <w:rFonts w:ascii="Times New Roman" w:hAnsi="Times New Roman" w:cs="Times New Roman"/>
-        </w:rPr>
-        <w:t>Complementar  algunas HU.</w:t>
+      <w:proofErr w:type="gramStart"/>
+      <w:r>
+        <w:rPr>
+          <w:rFonts w:ascii="Times New Roman" w:hAnsi="Times New Roman" w:cs="Times New Roman"/>
+        </w:rPr>
+        <w:t>Complementar  algunas</w:t>
+      </w:r>
+      <w:proofErr w:type="gramEnd"/>
+      <w:r>
+        <w:rPr>
+          <w:rFonts w:ascii="Times New Roman" w:hAnsi="Times New Roman" w:cs="Times New Roman"/>
+        </w:rPr>
+        <w:t xml:space="preserve"> HU.</w:t>
       </w:r>
       <w:r>
         <w:rPr>
@@ -2806,7 +4030,16 @@
           <w:i/>
           <w:iCs/>
         </w:rPr>
-        <w:t>¿Qué voy a hacer hoy?:</w:t>
+        <w:t>¿Qué voy a hacer hoy</w:t>
+      </w:r>
+      <w:proofErr w:type="gramStart"/>
+      <w:r>
+        <w:rPr>
+          <w:rFonts w:ascii="Times New Roman" w:hAnsi="Times New Roman" w:cs="Times New Roman"/>
+          <w:i/>
+          <w:iCs/>
+        </w:rPr>
+        <w:t>?:</w:t>
       </w:r>
       <w:r>
         <w:rPr>
@@ -2820,7 +4053,16 @@
           <w:i/>
           <w:iCs/>
         </w:rPr>
-        <w:t>Ayudar a ponerle el tamaño y prioridad a cada HU y creación de Bitácora</w:t>
+        <w:t>Ayudar</w:t>
+      </w:r>
+      <w:proofErr w:type="gramEnd"/>
+      <w:r>
+        <w:rPr>
+          <w:rFonts w:ascii="Times New Roman" w:hAnsi="Times New Roman" w:cs="Times New Roman"/>
+          <w:i/>
+          <w:iCs/>
+        </w:rPr>
+        <w:t xml:space="preserve"> a ponerle el tamaño y prioridad a cada HU y creación de Bitácora</w:t>
       </w:r>
       <w:r>
         <w:rPr>
@@ -2880,6 +4122,1805 @@
           <w:rFonts w:ascii="Times New Roman" w:hAnsi="Times New Roman" w:cs="Times New Roman"/>
         </w:rPr>
         <w:t>Ninguna</w:t>
+      </w:r>
+    </w:p>
+    <w:p>
+      <w:pPr>
+        <w:pStyle w:val="Ttulo2"/>
+        <w:rPr>
+          <w:rFonts w:cs="Times New Roman"/>
+        </w:rPr>
+      </w:pPr>
+      <w:bookmarkStart w:id="5" w:name="_Toc240394455"/>
+      <w:r>
+        <w:rPr>
+          <w:rFonts w:cs="Times New Roman"/>
+        </w:rPr>
+        <w:lastRenderedPageBreak/>
+        <w:t xml:space="preserve">Sprint </w:t>
+      </w:r>
+      <w:r>
+        <w:rPr>
+          <w:rFonts w:cs="Times New Roman"/>
+        </w:rPr>
+        <w:t>5</w:t>
+      </w:r>
+      <w:r>
+        <w:rPr>
+          <w:rFonts w:cs="Times New Roman"/>
+        </w:rPr>
+        <w:t xml:space="preserve">- Daily Stand-up: </w:t>
+      </w:r>
+      <w:r>
+        <w:rPr>
+          <w:rFonts w:cs="Times New Roman"/>
+        </w:rPr>
+        <w:t>1</w:t>
+      </w:r>
+      <w:r>
+        <w:rPr>
+          <w:rFonts w:cs="Times New Roman"/>
+        </w:rPr>
+        <w:t>5</w:t>
+      </w:r>
+      <w:r>
+        <w:rPr>
+          <w:rFonts w:cs="Times New Roman"/>
+        </w:rPr>
+        <w:t>/9/2026</w:t>
+      </w:r>
+      <w:bookmarkEnd w:id="5"/>
+    </w:p>
+    <w:p>
+      <w:pPr>
+        <w:ind w:left="708" w:firstLine="12"/>
+        <w:rPr>
+          <w:rFonts w:ascii="Times New Roman" w:hAnsi="Times New Roman" w:cs="Times New Roman"/>
+        </w:rPr>
+      </w:pPr>
+      <w:r>
+        <w:rPr>
+          <w:rFonts w:ascii="Times New Roman" w:hAnsi="Times New Roman" w:cs="Times New Roman"/>
+          <w:b/>
+          <w:bCs/>
+        </w:rPr>
+        <w:t xml:space="preserve">Hora de </w:t>
+      </w:r>
+      <w:proofErr w:type="gramStart"/>
+      <w:r>
+        <w:rPr>
+          <w:rFonts w:ascii="Times New Roman" w:hAnsi="Times New Roman" w:cs="Times New Roman"/>
+          <w:b/>
+          <w:bCs/>
+        </w:rPr>
+        <w:t>inicio:</w:t>
+      </w:r>
+      <w:r>
+        <w:rPr>
+          <w:rFonts w:ascii="Times New Roman" w:hAnsi="Times New Roman" w:cs="Times New Roman"/>
+        </w:rPr>
+        <w:t>15:00</w:t>
+      </w:r>
+      <w:proofErr w:type="gramEnd"/>
+      <w:r>
+        <w:rPr>
+          <w:rFonts w:ascii="Times New Roman" w:hAnsi="Times New Roman" w:cs="Times New Roman"/>
+        </w:rPr>
+        <w:t xml:space="preserve"> | </w:t>
+      </w:r>
+      <w:r>
+        <w:rPr>
+          <w:rFonts w:ascii="Times New Roman" w:hAnsi="Times New Roman" w:cs="Times New Roman"/>
+          <w:b/>
+          <w:bCs/>
+        </w:rPr>
+        <w:t>Hora de finalización:</w:t>
+      </w:r>
+      <w:r>
+        <w:rPr>
+          <w:rFonts w:ascii="Times New Roman" w:hAnsi="Times New Roman" w:cs="Times New Roman"/>
+        </w:rPr>
+        <w:t> 15:16</w:t>
+      </w:r>
+      <w:r>
+        <w:rPr>
+          <w:rFonts w:ascii="Times New Roman" w:hAnsi="Times New Roman" w:cs="Times New Roman"/>
+        </w:rPr>
+        <w:br/>
+      </w:r>
+      <w:r>
+        <w:rPr>
+          <w:rFonts w:ascii="Times New Roman" w:hAnsi="Times New Roman" w:cs="Times New Roman"/>
+          <w:b/>
+          <w:bCs/>
+        </w:rPr>
+        <w:t>Modalidad:</w:t>
+      </w:r>
+      <w:r>
+        <w:rPr>
+          <w:rFonts w:ascii="Times New Roman" w:hAnsi="Times New Roman" w:cs="Times New Roman"/>
+        </w:rPr>
+        <w:t> virtual</w:t>
+      </w:r>
+    </w:p>
+    <w:p>
+      <w:pPr>
+        <w:rPr>
+          <w:rFonts w:ascii="Times New Roman" w:hAnsi="Times New Roman" w:cs="Times New Roman"/>
+          <w:b/>
+          <w:bCs/>
+        </w:rPr>
+      </w:pPr>
+      <w:r>
+        <w:rPr>
+          <w:rFonts w:ascii="Times New Roman" w:hAnsi="Times New Roman" w:cs="Times New Roman"/>
+          <w:b/>
+          <w:bCs/>
+        </w:rPr>
+        <w:t>Reporte de Integrantes</w:t>
+      </w:r>
+    </w:p>
+    <w:p>
+      <w:pPr>
+        <w:rPr>
+          <w:rFonts w:ascii="Times New Roman" w:hAnsi="Times New Roman" w:cs="Times New Roman"/>
+        </w:rPr>
+      </w:pPr>
+      <w:r>
+        <w:rPr>
+          <w:rFonts w:ascii="Times New Roman" w:hAnsi="Times New Roman" w:cs="Times New Roman"/>
+          <w:b/>
+          <w:bCs/>
+        </w:rPr>
+        <w:t xml:space="preserve">Laura S. Carrero Guevara (Scrum </w:t>
+      </w:r>
+      <w:proofErr w:type="gramStart"/>
+      <w:r>
+        <w:rPr>
+          <w:rFonts w:ascii="Times New Roman" w:hAnsi="Times New Roman" w:cs="Times New Roman"/>
+          <w:b/>
+          <w:bCs/>
+        </w:rPr>
+        <w:t>Master</w:t>
+      </w:r>
+      <w:proofErr w:type="gramEnd"/>
+      <w:r>
+        <w:rPr>
+          <w:rFonts w:ascii="Times New Roman" w:hAnsi="Times New Roman" w:cs="Times New Roman"/>
+          <w:b/>
+          <w:bCs/>
+        </w:rPr>
+        <w:t xml:space="preserve"> / Líder)</w:t>
+      </w:r>
+      <w:r>
+        <w:rPr>
+          <w:rFonts w:ascii="Times New Roman" w:hAnsi="Times New Roman" w:cs="Times New Roman"/>
+        </w:rPr>
+        <w:br/>
+      </w:r>
+      <w:r>
+        <w:rPr>
+          <w:rFonts w:ascii="Times New Roman" w:hAnsi="Times New Roman" w:cs="Times New Roman"/>
+          <w:i/>
+          <w:iCs/>
+        </w:rPr>
+        <w:t>¿Qué hice ayer?:</w:t>
+      </w:r>
+      <w:r>
+        <w:rPr>
+          <w:rFonts w:ascii="Times New Roman" w:hAnsi="Times New Roman" w:cs="Times New Roman"/>
+        </w:rPr>
+        <w:t> </w:t>
+      </w:r>
+      <w:r>
+        <w:rPr>
+          <w:rFonts w:ascii="Times New Roman" w:hAnsi="Times New Roman" w:cs="Times New Roman"/>
+          <w:i/>
+          <w:iCs/>
+        </w:rPr>
+        <w:t>Ayudar a ponerle el tamaño y prioridad a cada HU</w:t>
+      </w:r>
+      <w:r>
+        <w:rPr>
+          <w:rFonts w:ascii="Times New Roman" w:hAnsi="Times New Roman" w:cs="Times New Roman"/>
+        </w:rPr>
+        <w:br/>
+      </w:r>
+      <w:r>
+        <w:rPr>
+          <w:rFonts w:ascii="Times New Roman" w:hAnsi="Times New Roman" w:cs="Times New Roman"/>
+          <w:i/>
+          <w:iCs/>
+        </w:rPr>
+        <w:t xml:space="preserve">¿Qué voy a hacer hoy?:  </w:t>
+      </w:r>
+      <w:r>
+        <w:rPr>
+          <w:rFonts w:ascii="Times New Roman" w:hAnsi="Times New Roman" w:cs="Times New Roman"/>
+          <w:i/>
+          <w:iCs/>
+        </w:rPr>
+        <w:t>nada</w:t>
+      </w:r>
+      <w:r>
+        <w:rPr>
+          <w:rFonts w:ascii="Times New Roman" w:hAnsi="Times New Roman" w:cs="Times New Roman"/>
+        </w:rPr>
+        <w:br/>
+      </w:r>
+      <w:r>
+        <w:rPr>
+          <w:rFonts w:ascii="Times New Roman" w:hAnsi="Times New Roman" w:cs="Times New Roman"/>
+          <w:i/>
+          <w:iCs/>
+        </w:rPr>
+        <w:t>Impedimentos:</w:t>
+      </w:r>
+      <w:r>
+        <w:rPr>
+          <w:rFonts w:ascii="Times New Roman" w:hAnsi="Times New Roman" w:cs="Times New Roman"/>
+        </w:rPr>
+        <w:t> ninguno</w:t>
+      </w:r>
+      <w:r>
+        <w:rPr>
+          <w:rFonts w:ascii="Times New Roman" w:hAnsi="Times New Roman" w:cs="Times New Roman"/>
+        </w:rPr>
+        <w:t xml:space="preserve"> y asignar HU</w:t>
+      </w:r>
+    </w:p>
+    <w:p>
+      <w:pPr>
+        <w:rPr>
+          <w:rFonts w:ascii="Times New Roman" w:hAnsi="Times New Roman" w:cs="Times New Roman"/>
+        </w:rPr>
+      </w:pPr>
+      <w:r>
+        <w:rPr>
+          <w:rFonts w:ascii="Times New Roman" w:hAnsi="Times New Roman" w:cs="Times New Roman"/>
+          <w:b/>
+          <w:bCs/>
+        </w:rPr>
+        <w:t>Juan F. Chaparro Jurado (</w:t>
+      </w:r>
+      <w:proofErr w:type="spellStart"/>
+      <w:r>
+        <w:rPr>
+          <w:rFonts w:ascii="Times New Roman" w:hAnsi="Times New Roman" w:cs="Times New Roman"/>
+          <w:b/>
+          <w:bCs/>
+        </w:rPr>
+        <w:t>Product</w:t>
+      </w:r>
+      <w:proofErr w:type="spellEnd"/>
+      <w:r>
+        <w:rPr>
+          <w:rFonts w:ascii="Times New Roman" w:hAnsi="Times New Roman" w:cs="Times New Roman"/>
+          <w:b/>
+          <w:bCs/>
+        </w:rPr>
+        <w:t xml:space="preserve"> Owner / </w:t>
+      </w:r>
+      <w:proofErr w:type="spellStart"/>
+      <w:r>
+        <w:rPr>
+          <w:rFonts w:ascii="Times New Roman" w:hAnsi="Times New Roman" w:cs="Times New Roman"/>
+          <w:b/>
+          <w:bCs/>
+        </w:rPr>
+        <w:t>Backend</w:t>
+      </w:r>
+      <w:proofErr w:type="spellEnd"/>
+      <w:r>
+        <w:rPr>
+          <w:rFonts w:ascii="Times New Roman" w:hAnsi="Times New Roman" w:cs="Times New Roman"/>
+          <w:b/>
+          <w:bCs/>
+        </w:rPr>
+        <w:t>)</w:t>
+      </w:r>
+      <w:r>
+        <w:rPr>
+          <w:rFonts w:ascii="Times New Roman" w:hAnsi="Times New Roman" w:cs="Times New Roman"/>
+        </w:rPr>
+        <w:br/>
+      </w:r>
+      <w:r>
+        <w:rPr>
+          <w:rFonts w:ascii="Times New Roman" w:hAnsi="Times New Roman" w:cs="Times New Roman"/>
+          <w:i/>
+          <w:iCs/>
+        </w:rPr>
+        <w:t>¿Qué hice ayer?:</w:t>
+      </w:r>
+      <w:r>
+        <w:rPr>
+          <w:rFonts w:ascii="Times New Roman" w:hAnsi="Times New Roman" w:cs="Times New Roman"/>
+        </w:rPr>
+        <w:t> </w:t>
+      </w:r>
+      <w:r>
+        <w:rPr>
+          <w:rFonts w:ascii="Times New Roman" w:hAnsi="Times New Roman" w:cs="Times New Roman"/>
+        </w:rPr>
+        <w:t xml:space="preserve">ver </w:t>
+      </w:r>
+      <w:proofErr w:type="gramStart"/>
+      <w:r>
+        <w:rPr>
+          <w:rFonts w:ascii="Times New Roman" w:hAnsi="Times New Roman" w:cs="Times New Roman"/>
+        </w:rPr>
+        <w:t>la posibles aplicaciones</w:t>
+      </w:r>
+      <w:proofErr w:type="gramEnd"/>
+      <w:r>
+        <w:rPr>
+          <w:rFonts w:ascii="Times New Roman" w:hAnsi="Times New Roman" w:cs="Times New Roman"/>
+        </w:rPr>
+        <w:t xml:space="preserve"> del </w:t>
+      </w:r>
+      <w:proofErr w:type="spellStart"/>
+      <w:r>
+        <w:rPr>
+          <w:rFonts w:ascii="Times New Roman" w:hAnsi="Times New Roman" w:cs="Times New Roman"/>
+        </w:rPr>
+        <w:t>backend</w:t>
+      </w:r>
+      <w:proofErr w:type="spellEnd"/>
+      <w:r>
+        <w:rPr>
+          <w:rFonts w:ascii="Times New Roman" w:hAnsi="Times New Roman" w:cs="Times New Roman"/>
+        </w:rPr>
+        <w:br/>
+      </w:r>
+      <w:r>
+        <w:rPr>
+          <w:rFonts w:ascii="Times New Roman" w:hAnsi="Times New Roman" w:cs="Times New Roman"/>
+          <w:i/>
+          <w:iCs/>
+        </w:rPr>
+        <w:t>¿Qué voy a hacer hoy</w:t>
+      </w:r>
+      <w:proofErr w:type="gramStart"/>
+      <w:r>
+        <w:rPr>
+          <w:rFonts w:ascii="Times New Roman" w:hAnsi="Times New Roman" w:cs="Times New Roman"/>
+          <w:i/>
+          <w:iCs/>
+        </w:rPr>
+        <w:t>?:</w:t>
+      </w:r>
+      <w:r>
+        <w:rPr>
+          <w:rFonts w:ascii="Times New Roman" w:hAnsi="Times New Roman" w:cs="Times New Roman"/>
+        </w:rPr>
+        <w:t xml:space="preserve">  </w:t>
+      </w:r>
+      <w:r>
+        <w:rPr>
+          <w:rFonts w:ascii="Times New Roman" w:hAnsi="Times New Roman" w:cs="Times New Roman"/>
+        </w:rPr>
+        <w:t>nada</w:t>
+      </w:r>
+      <w:proofErr w:type="gramEnd"/>
+      <w:r>
+        <w:rPr>
+          <w:rFonts w:ascii="Times New Roman" w:hAnsi="Times New Roman" w:cs="Times New Roman"/>
+        </w:rPr>
+        <w:br/>
+      </w:r>
+      <w:r>
+        <w:rPr>
+          <w:rFonts w:ascii="Times New Roman" w:hAnsi="Times New Roman" w:cs="Times New Roman"/>
+          <w:i/>
+          <w:iCs/>
+        </w:rPr>
+        <w:t>Impedimentos:</w:t>
+      </w:r>
+      <w:r>
+        <w:rPr>
+          <w:rFonts w:ascii="Times New Roman" w:hAnsi="Times New Roman" w:cs="Times New Roman"/>
+        </w:rPr>
+        <w:t> Ninguno.</w:t>
+      </w:r>
+    </w:p>
+    <w:p>
+      <w:pPr>
+        <w:rPr>
+          <w:rFonts w:ascii="Times New Roman" w:hAnsi="Times New Roman" w:cs="Times New Roman"/>
+        </w:rPr>
+      </w:pPr>
+      <w:r>
+        <w:rPr>
+          <w:rFonts w:ascii="Times New Roman" w:hAnsi="Times New Roman" w:cs="Times New Roman"/>
+          <w:b/>
+          <w:bCs/>
+        </w:rPr>
+        <w:t xml:space="preserve">Daniel M. Plazas López (Sprint Planner / QA / </w:t>
+      </w:r>
+      <w:r>
+        <w:rPr>
+          <w:rFonts w:ascii="Times New Roman" w:hAnsi="Times New Roman" w:cs="Times New Roman"/>
+          <w:b/>
+          <w:bCs/>
+        </w:rPr>
+        <w:t>Base</w:t>
+      </w:r>
+      <w:r>
+        <w:rPr>
+          <w:rFonts w:ascii="Times New Roman" w:hAnsi="Times New Roman" w:cs="Times New Roman"/>
+          <w:b/>
+          <w:bCs/>
+        </w:rPr>
+        <w:t xml:space="preserve"> de Datos)</w:t>
+      </w:r>
+      <w:r>
+        <w:rPr>
+          <w:rFonts w:ascii="Times New Roman" w:hAnsi="Times New Roman" w:cs="Times New Roman"/>
+        </w:rPr>
+        <w:br/>
+      </w:r>
+      <w:r>
+        <w:rPr>
+          <w:rFonts w:ascii="Times New Roman" w:hAnsi="Times New Roman" w:cs="Times New Roman"/>
+          <w:i/>
+          <w:iCs/>
+        </w:rPr>
+        <w:t>¿Qué hice ayer?:</w:t>
+      </w:r>
+      <w:r>
+        <w:rPr>
+          <w:rFonts w:ascii="Times New Roman" w:hAnsi="Times New Roman" w:cs="Times New Roman"/>
+        </w:rPr>
+        <w:t> </w:t>
+      </w:r>
+      <w:r>
+        <w:rPr>
+          <w:rFonts w:ascii="Times New Roman" w:hAnsi="Times New Roman" w:cs="Times New Roman"/>
+        </w:rPr>
+        <w:t>crear los casos de uso</w:t>
+      </w:r>
+      <w:r>
+        <w:rPr>
+          <w:rFonts w:ascii="Times New Roman" w:hAnsi="Times New Roman" w:cs="Times New Roman"/>
+        </w:rPr>
+        <w:br/>
+      </w:r>
+      <w:r>
+        <w:rPr>
+          <w:rFonts w:ascii="Times New Roman" w:hAnsi="Times New Roman" w:cs="Times New Roman"/>
+          <w:i/>
+          <w:iCs/>
+        </w:rPr>
+        <w:t>¿Qué voy a hacer hoy?:</w:t>
+      </w:r>
+      <w:r>
+        <w:rPr>
+          <w:rFonts w:ascii="Times New Roman" w:hAnsi="Times New Roman" w:cs="Times New Roman"/>
+        </w:rPr>
+        <w:t> </w:t>
+      </w:r>
+      <w:r>
+        <w:rPr>
+          <w:rFonts w:ascii="Times New Roman" w:hAnsi="Times New Roman" w:cs="Times New Roman"/>
+        </w:rPr>
+        <w:t>nada</w:t>
+      </w:r>
+      <w:r>
+        <w:rPr>
+          <w:rFonts w:ascii="Times New Roman" w:hAnsi="Times New Roman" w:cs="Times New Roman"/>
+        </w:rPr>
+        <w:t xml:space="preserve"> </w:t>
+      </w:r>
+      <w:r>
+        <w:rPr>
+          <w:rFonts w:ascii="Times New Roman" w:hAnsi="Times New Roman" w:cs="Times New Roman"/>
+        </w:rPr>
+        <w:br/>
+      </w:r>
+      <w:r>
+        <w:rPr>
+          <w:rFonts w:ascii="Times New Roman" w:hAnsi="Times New Roman" w:cs="Times New Roman"/>
+          <w:i/>
+          <w:iCs/>
+        </w:rPr>
+        <w:t>Impedimentos:</w:t>
+      </w:r>
+      <w:r>
+        <w:rPr>
+          <w:rFonts w:ascii="Times New Roman" w:hAnsi="Times New Roman" w:cs="Times New Roman"/>
+        </w:rPr>
+        <w:t> Ninguno.</w:t>
+      </w:r>
+    </w:p>
+    <w:p>
+      <w:pPr>
+        <w:rPr>
+          <w:rFonts w:ascii="Times New Roman" w:hAnsi="Times New Roman" w:cs="Times New Roman"/>
+        </w:rPr>
+      </w:pPr>
+      <w:r>
+        <w:rPr>
+          <w:rFonts w:ascii="Times New Roman" w:hAnsi="Times New Roman" w:cs="Times New Roman"/>
+          <w:b/>
+          <w:bCs/>
+        </w:rPr>
+        <w:t xml:space="preserve">Nikolas H. García </w:t>
+      </w:r>
+      <w:proofErr w:type="gramStart"/>
+      <w:r>
+        <w:rPr>
+          <w:rFonts w:ascii="Times New Roman" w:hAnsi="Times New Roman" w:cs="Times New Roman"/>
+          <w:b/>
+          <w:bCs/>
+        </w:rPr>
+        <w:t>Cure</w:t>
+      </w:r>
+      <w:proofErr w:type="gramEnd"/>
+      <w:r>
+        <w:rPr>
+          <w:rFonts w:ascii="Times New Roman" w:hAnsi="Times New Roman" w:cs="Times New Roman"/>
+          <w:b/>
+          <w:bCs/>
+        </w:rPr>
+        <w:t xml:space="preserve"> (DevOps / </w:t>
+      </w:r>
+      <w:proofErr w:type="spellStart"/>
+      <w:r>
+        <w:rPr>
+          <w:rFonts w:ascii="Times New Roman" w:hAnsi="Times New Roman" w:cs="Times New Roman"/>
+          <w:b/>
+          <w:bCs/>
+        </w:rPr>
+        <w:t>Frontend</w:t>
+      </w:r>
+      <w:proofErr w:type="spellEnd"/>
+      <w:r>
+        <w:rPr>
+          <w:rFonts w:ascii="Times New Roman" w:hAnsi="Times New Roman" w:cs="Times New Roman"/>
+          <w:b/>
+          <w:bCs/>
+        </w:rPr>
+        <w:t>)</w:t>
+      </w:r>
+      <w:r>
+        <w:rPr>
+          <w:rFonts w:ascii="Times New Roman" w:hAnsi="Times New Roman" w:cs="Times New Roman"/>
+        </w:rPr>
+        <w:br/>
+      </w:r>
+      <w:r>
+        <w:rPr>
+          <w:rFonts w:ascii="Times New Roman" w:hAnsi="Times New Roman" w:cs="Times New Roman"/>
+          <w:i/>
+          <w:iCs/>
+        </w:rPr>
+        <w:t>¿Qué hice ayer?:</w:t>
+      </w:r>
+      <w:r>
+        <w:rPr>
+          <w:rFonts w:ascii="Times New Roman" w:hAnsi="Times New Roman" w:cs="Times New Roman"/>
+        </w:rPr>
+        <w:t xml:space="preserve"> </w:t>
+      </w:r>
+      <w:r>
+        <w:rPr>
+          <w:rFonts w:ascii="Times New Roman" w:hAnsi="Times New Roman" w:cs="Times New Roman"/>
+          <w:i/>
+          <w:iCs/>
+        </w:rPr>
+        <w:t>Ayudar a ponerle el tamaño y prioridad a cada HU y creación de Bitácora</w:t>
+      </w:r>
+      <w:r>
+        <w:rPr>
+          <w:rFonts w:ascii="Times New Roman" w:hAnsi="Times New Roman" w:cs="Times New Roman"/>
+        </w:rPr>
+        <w:br/>
+      </w:r>
+      <w:r>
+        <w:rPr>
+          <w:rFonts w:ascii="Times New Roman" w:hAnsi="Times New Roman" w:cs="Times New Roman"/>
+          <w:i/>
+          <w:iCs/>
+        </w:rPr>
+        <w:t>¿Qué voy a hacer hoy?:</w:t>
+      </w:r>
+      <w:r>
+        <w:rPr>
+          <w:rFonts w:ascii="Times New Roman" w:hAnsi="Times New Roman" w:cs="Times New Roman"/>
+        </w:rPr>
+        <w:t xml:space="preserve">  </w:t>
+      </w:r>
+      <w:r>
+        <w:rPr>
+          <w:rFonts w:ascii="Times New Roman" w:hAnsi="Times New Roman" w:cs="Times New Roman"/>
+        </w:rPr>
+        <w:t>nada</w:t>
+      </w:r>
+      <w:r>
+        <w:rPr>
+          <w:rFonts w:ascii="Times New Roman" w:hAnsi="Times New Roman" w:cs="Times New Roman"/>
+        </w:rPr>
+        <w:br/>
+      </w:r>
+      <w:r>
+        <w:rPr>
+          <w:rFonts w:ascii="Times New Roman" w:hAnsi="Times New Roman" w:cs="Times New Roman"/>
+          <w:i/>
+          <w:iCs/>
+          <w:sz w:val="22"/>
+          <w:szCs w:val="22"/>
+        </w:rPr>
+        <w:t>Impedimentos:</w:t>
+      </w:r>
+      <w:r>
+        <w:rPr>
+          <w:rFonts w:ascii="Times New Roman" w:hAnsi="Times New Roman" w:cs="Times New Roman"/>
+          <w:sz w:val="22"/>
+          <w:szCs w:val="22"/>
+        </w:rPr>
+        <w:t> ninguno.</w:t>
+      </w:r>
+    </w:p>
+    <w:p>
+      <w:pPr>
+        <w:rPr>
+          <w:rFonts w:ascii="Times New Roman" w:hAnsi="Times New Roman" w:cs="Times New Roman"/>
+        </w:rPr>
+      </w:pPr>
+      <w:r>
+        <w:rPr>
+          <w:rFonts w:ascii="Times New Roman" w:hAnsi="Times New Roman" w:cs="Times New Roman"/>
+          <w:b/>
+          <w:bCs/>
+        </w:rPr>
+        <w:t>Notas adicionales</w:t>
+      </w:r>
+      <w:r>
+        <w:rPr>
+          <w:rFonts w:ascii="Times New Roman" w:hAnsi="Times New Roman" w:cs="Times New Roman"/>
+          <w:b/>
+          <w:bCs/>
+        </w:rPr>
+        <w:t>:</w:t>
+      </w:r>
+      <w:r>
+        <w:rPr>
+          <w:rFonts w:ascii="Times New Roman" w:hAnsi="Times New Roman" w:cs="Times New Roman"/>
+        </w:rPr>
+        <w:t xml:space="preserve"> </w:t>
+      </w:r>
+      <w:r>
+        <w:rPr>
+          <w:rFonts w:ascii="Times New Roman" w:hAnsi="Times New Roman" w:cs="Times New Roman"/>
+        </w:rPr>
+        <w:t>Ninguna</w:t>
+      </w:r>
+    </w:p>
+    <w:p>
+      <w:pPr>
+        <w:pStyle w:val="Ttulo1"/>
+        <w:rPr>
+          <w:rFonts w:eastAsia="Times New Roman"/>
+          <w:lang w:eastAsia="es-CO"/>
+        </w:rPr>
+      </w:pPr>
+      <w:r>
+        <w:br w:type="page"/>
+      </w:r>
+      <w:bookmarkStart w:id="6" w:name="_Toc240394456"/>
+      <w:r>
+        <w:rPr>
+          <w:rFonts w:eastAsia="Times New Roman"/>
+          <w:lang w:eastAsia="es-CO"/>
+        </w:rPr>
+        <w:lastRenderedPageBreak/>
+        <w:t>Calendario de Actividades</w:t>
+      </w:r>
+      <w:bookmarkEnd w:id="6"/>
+    </w:p>
+    <w:tbl>
+      <w:tblPr>
+        <w:tblStyle w:val="Tablaconcuadrcula"/>
+        <w:tblW w:w="0" w:type="auto"/>
+        <w:tblLook w:val="04A0" w:firstRow="1" w:lastRow="0" w:firstColumn="1" w:lastColumn="0" w:noHBand="0" w:noVBand="1"/>
+      </w:tblPr>
+      <w:tblGrid>
+        <w:gridCol w:w="1583"/>
+        <w:gridCol w:w="1849"/>
+        <w:gridCol w:w="5396"/>
+      </w:tblGrid>
+      <w:tr>
+        <w:tc>
+          <w:tcPr>
+            <w:tcW w:w="0" w:type="auto"/>
+            <w:hideMark/>
+          </w:tcPr>
+          <w:p>
+            <w:pPr>
+              <w:spacing w:before="100" w:beforeAutospacing="1" w:after="100" w:afterAutospacing="1"/>
+              <w:jc w:val="center"/>
+              <w:rPr>
+                <w:rFonts w:ascii="Times New Roman" w:eastAsia="Times New Roman" w:hAnsi="Times New Roman" w:cs="Times New Roman"/>
+                <w:b/>
+                <w:bCs/>
+                <w:kern w:val="0"/>
+                <w:sz w:val="24"/>
+                <w:szCs w:val="24"/>
+                <w:lang w:eastAsia="es-CO"/>
+                <w14:ligatures w14:val="none"/>
+              </w:rPr>
+            </w:pPr>
+            <w:r>
+              <w:rPr>
+                <w:rFonts w:ascii="Times New Roman" w:eastAsia="Times New Roman" w:hAnsi="Times New Roman" w:cs="Times New Roman"/>
+                <w:b/>
+                <w:bCs/>
+                <w:kern w:val="0"/>
+                <w:sz w:val="24"/>
+                <w:szCs w:val="24"/>
+                <w:lang w:eastAsia="es-CO"/>
+                <w14:ligatures w14:val="none"/>
+              </w:rPr>
+              <w:t>Fecha / Periodo</w:t>
+            </w:r>
+          </w:p>
+        </w:tc>
+        <w:tc>
+          <w:tcPr>
+            <w:tcW w:w="0" w:type="auto"/>
+            <w:hideMark/>
+          </w:tcPr>
+          <w:p>
+            <w:pPr>
+              <w:spacing w:before="100" w:beforeAutospacing="1" w:after="100" w:afterAutospacing="1"/>
+              <w:jc w:val="center"/>
+              <w:rPr>
+                <w:rFonts w:ascii="Times New Roman" w:eastAsia="Times New Roman" w:hAnsi="Times New Roman" w:cs="Times New Roman"/>
+                <w:b/>
+                <w:bCs/>
+                <w:kern w:val="0"/>
+                <w:sz w:val="24"/>
+                <w:szCs w:val="24"/>
+                <w:lang w:eastAsia="es-CO"/>
+                <w14:ligatures w14:val="none"/>
+              </w:rPr>
+            </w:pPr>
+            <w:r>
+              <w:rPr>
+                <w:rFonts w:ascii="Times New Roman" w:eastAsia="Times New Roman" w:hAnsi="Times New Roman" w:cs="Times New Roman"/>
+                <w:b/>
+                <w:bCs/>
+                <w:kern w:val="0"/>
+                <w:sz w:val="24"/>
+                <w:szCs w:val="24"/>
+                <w:lang w:eastAsia="es-CO"/>
+                <w14:ligatures w14:val="none"/>
+              </w:rPr>
+              <w:t>Fase</w:t>
+            </w:r>
+          </w:p>
+        </w:tc>
+        <w:tc>
+          <w:tcPr>
+            <w:tcW w:w="0" w:type="auto"/>
+            <w:hideMark/>
+          </w:tcPr>
+          <w:p>
+            <w:pPr>
+              <w:spacing w:before="100" w:beforeAutospacing="1" w:after="100" w:afterAutospacing="1"/>
+              <w:jc w:val="center"/>
+              <w:rPr>
+                <w:rFonts w:ascii="Times New Roman" w:eastAsia="Times New Roman" w:hAnsi="Times New Roman" w:cs="Times New Roman"/>
+                <w:b/>
+                <w:bCs/>
+                <w:kern w:val="0"/>
+                <w:sz w:val="24"/>
+                <w:szCs w:val="24"/>
+                <w:lang w:eastAsia="es-CO"/>
+                <w14:ligatures w14:val="none"/>
+              </w:rPr>
+            </w:pPr>
+            <w:r>
+              <w:rPr>
+                <w:rFonts w:ascii="Times New Roman" w:eastAsia="Times New Roman" w:hAnsi="Times New Roman" w:cs="Times New Roman"/>
+                <w:b/>
+                <w:bCs/>
+                <w:kern w:val="0"/>
+                <w:sz w:val="24"/>
+                <w:szCs w:val="24"/>
+                <w:lang w:eastAsia="es-CO"/>
+                <w14:ligatures w14:val="none"/>
+              </w:rPr>
+              <w:t>Actividades Técnicas</w:t>
+            </w:r>
+          </w:p>
+        </w:tc>
+      </w:tr>
+      <w:tr>
+        <w:trPr>
+          <w:trHeight w:val="853"/>
+        </w:trPr>
+        <w:tc>
+          <w:tcPr>
+            <w:tcW w:w="0" w:type="auto"/>
+            <w:hideMark/>
+          </w:tcPr>
+          <w:p>
+            <w:pPr>
+              <w:spacing w:before="100" w:beforeAutospacing="1" w:after="100" w:afterAutospacing="1"/>
+              <w:rPr>
+                <w:rFonts w:ascii="Times New Roman" w:eastAsia="Times New Roman" w:hAnsi="Times New Roman" w:cs="Times New Roman"/>
+                <w:kern w:val="0"/>
+                <w:sz w:val="24"/>
+                <w:szCs w:val="24"/>
+                <w:lang w:eastAsia="es-CO"/>
+                <w14:ligatures w14:val="none"/>
+              </w:rPr>
+            </w:pPr>
+            <w:r>
+              <w:rPr>
+                <w:rFonts w:ascii="Times New Roman" w:eastAsia="Times New Roman" w:hAnsi="Times New Roman" w:cs="Times New Roman"/>
+                <w:b/>
+                <w:bCs/>
+                <w:kern w:val="0"/>
+                <w:sz w:val="24"/>
+                <w:szCs w:val="24"/>
+                <w:lang w:eastAsia="es-CO"/>
+                <w14:ligatures w14:val="none"/>
+              </w:rPr>
+              <w:t xml:space="preserve">Antes del 8 </w:t>
+            </w:r>
+            <w:proofErr w:type="spellStart"/>
+            <w:r>
+              <w:rPr>
+                <w:rFonts w:ascii="Times New Roman" w:eastAsia="Times New Roman" w:hAnsi="Times New Roman" w:cs="Times New Roman"/>
+                <w:b/>
+                <w:bCs/>
+                <w:kern w:val="0"/>
+                <w:sz w:val="24"/>
+                <w:szCs w:val="24"/>
+                <w:lang w:eastAsia="es-CO"/>
+                <w14:ligatures w14:val="none"/>
+              </w:rPr>
+              <w:t>sep</w:t>
+            </w:r>
+            <w:proofErr w:type="spellEnd"/>
+          </w:p>
+        </w:tc>
+        <w:tc>
+          <w:tcPr>
+            <w:tcW w:w="0" w:type="auto"/>
+            <w:hideMark/>
+          </w:tcPr>
+          <w:p>
+            <w:pPr>
+              <w:spacing w:before="100" w:beforeAutospacing="1" w:after="100" w:afterAutospacing="1"/>
+              <w:rPr>
+                <w:rFonts w:ascii="Times New Roman" w:eastAsia="Times New Roman" w:hAnsi="Times New Roman" w:cs="Times New Roman"/>
+                <w:kern w:val="0"/>
+                <w:sz w:val="24"/>
+                <w:szCs w:val="24"/>
+                <w:lang w:eastAsia="es-CO"/>
+                <w14:ligatures w14:val="none"/>
+              </w:rPr>
+            </w:pPr>
+            <w:r>
+              <w:rPr>
+                <w:rFonts w:ascii="Times New Roman" w:eastAsia="Times New Roman" w:hAnsi="Times New Roman" w:cs="Times New Roman"/>
+                <w:kern w:val="0"/>
+                <w:sz w:val="24"/>
+                <w:szCs w:val="24"/>
+                <w:lang w:eastAsia="es-CO"/>
+                <w14:ligatures w14:val="none"/>
+              </w:rPr>
+              <w:t>Ideación y Sprint 0</w:t>
+            </w:r>
+          </w:p>
+        </w:tc>
+        <w:tc>
+          <w:tcPr>
+            <w:tcW w:w="0" w:type="auto"/>
+            <w:hideMark/>
+          </w:tcPr>
+          <w:p>
+            <w:pPr>
+              <w:spacing w:before="100" w:beforeAutospacing="1" w:after="100" w:afterAutospacing="1"/>
+              <w:rPr>
+                <w:rFonts w:ascii="Times New Roman" w:eastAsia="Times New Roman" w:hAnsi="Times New Roman" w:cs="Times New Roman"/>
+                <w:kern w:val="0"/>
+                <w:sz w:val="24"/>
+                <w:szCs w:val="24"/>
+                <w:lang w:eastAsia="es-CO"/>
+                <w14:ligatures w14:val="none"/>
+              </w:rPr>
+            </w:pPr>
+            <w:r>
+              <w:rPr>
+                <w:rFonts w:ascii="Times New Roman" w:eastAsia="Times New Roman" w:hAnsi="Times New Roman" w:cs="Times New Roman"/>
+                <w:kern w:val="0"/>
+                <w:sz w:val="24"/>
+                <w:szCs w:val="24"/>
+                <w:lang w:eastAsia="es-CO"/>
+                <w14:ligatures w14:val="none"/>
+              </w:rPr>
+              <w:t xml:space="preserve">Estructuración del </w:t>
+            </w:r>
+            <w:r>
+              <w:rPr>
+                <w:rFonts w:ascii="Times New Roman" w:eastAsia="Times New Roman" w:hAnsi="Times New Roman" w:cs="Times New Roman"/>
+                <w:i/>
+                <w:iCs/>
+                <w:kern w:val="0"/>
+                <w:sz w:val="24"/>
+                <w:szCs w:val="24"/>
+                <w:lang w:eastAsia="es-CO"/>
+                <w14:ligatures w14:val="none"/>
+              </w:rPr>
+              <w:t xml:space="preserve">Project </w:t>
+            </w:r>
+            <w:proofErr w:type="spellStart"/>
+            <w:r>
+              <w:rPr>
+                <w:rFonts w:ascii="Times New Roman" w:eastAsia="Times New Roman" w:hAnsi="Times New Roman" w:cs="Times New Roman"/>
+                <w:i/>
+                <w:iCs/>
+                <w:kern w:val="0"/>
+                <w:sz w:val="24"/>
+                <w:szCs w:val="24"/>
+                <w:lang w:eastAsia="es-CO"/>
+                <w14:ligatures w14:val="none"/>
+              </w:rPr>
+              <w:t>Canvas</w:t>
+            </w:r>
+            <w:proofErr w:type="spellEnd"/>
+            <w:r>
+              <w:rPr>
+                <w:rFonts w:ascii="Times New Roman" w:eastAsia="Times New Roman" w:hAnsi="Times New Roman" w:cs="Times New Roman"/>
+                <w:kern w:val="0"/>
+                <w:sz w:val="24"/>
+                <w:szCs w:val="24"/>
+                <w:lang w:eastAsia="es-CO"/>
+                <w14:ligatures w14:val="none"/>
+              </w:rPr>
+              <w:t>, diseño de la arquitectura base y configuración inicial del repositorio. Definición de roles del equipo y redacción de la primera versión de las historias de usuario.</w:t>
+            </w:r>
+          </w:p>
+        </w:tc>
+      </w:tr>
+      <w:tr>
+        <w:tc>
+          <w:tcPr>
+            <w:tcW w:w="0" w:type="auto"/>
+            <w:hideMark/>
+          </w:tcPr>
+          <w:p>
+            <w:pPr>
+              <w:spacing w:before="100" w:beforeAutospacing="1" w:after="100" w:afterAutospacing="1"/>
+              <w:rPr>
+                <w:rFonts w:ascii="Times New Roman" w:eastAsia="Times New Roman" w:hAnsi="Times New Roman" w:cs="Times New Roman"/>
+                <w:kern w:val="0"/>
+                <w:sz w:val="24"/>
+                <w:szCs w:val="24"/>
+                <w:lang w:eastAsia="es-CO"/>
+                <w14:ligatures w14:val="none"/>
+              </w:rPr>
+            </w:pPr>
+            <w:r>
+              <w:rPr>
+                <w:rFonts w:ascii="Times New Roman" w:eastAsia="Times New Roman" w:hAnsi="Times New Roman" w:cs="Times New Roman"/>
+                <w:b/>
+                <w:bCs/>
+                <w:kern w:val="0"/>
+                <w:sz w:val="24"/>
+                <w:szCs w:val="24"/>
+                <w:lang w:eastAsia="es-CO"/>
+                <w14:ligatures w14:val="none"/>
+              </w:rPr>
+              <w:t xml:space="preserve">8 al 14 </w:t>
+            </w:r>
+            <w:proofErr w:type="spellStart"/>
+            <w:r>
+              <w:rPr>
+                <w:rFonts w:ascii="Times New Roman" w:eastAsia="Times New Roman" w:hAnsi="Times New Roman" w:cs="Times New Roman"/>
+                <w:b/>
+                <w:bCs/>
+                <w:kern w:val="0"/>
+                <w:sz w:val="24"/>
+                <w:szCs w:val="24"/>
+                <w:lang w:eastAsia="es-CO"/>
+                <w14:ligatures w14:val="none"/>
+              </w:rPr>
+              <w:t>sep</w:t>
+            </w:r>
+            <w:proofErr w:type="spellEnd"/>
+          </w:p>
+        </w:tc>
+        <w:tc>
+          <w:tcPr>
+            <w:tcW w:w="0" w:type="auto"/>
+            <w:hideMark/>
+          </w:tcPr>
+          <w:p>
+            <w:pPr>
+              <w:spacing w:before="100" w:beforeAutospacing="1" w:after="100" w:afterAutospacing="1"/>
+              <w:rPr>
+                <w:rFonts w:ascii="Times New Roman" w:eastAsia="Times New Roman" w:hAnsi="Times New Roman" w:cs="Times New Roman"/>
+                <w:kern w:val="0"/>
+                <w:sz w:val="24"/>
+                <w:szCs w:val="24"/>
+                <w:lang w:eastAsia="es-CO"/>
+                <w14:ligatures w14:val="none"/>
+              </w:rPr>
+            </w:pPr>
+            <w:r>
+              <w:rPr>
+                <w:rFonts w:ascii="Times New Roman" w:eastAsia="Times New Roman" w:hAnsi="Times New Roman" w:cs="Times New Roman"/>
+                <w:kern w:val="0"/>
+                <w:sz w:val="24"/>
+                <w:szCs w:val="24"/>
+                <w:lang w:eastAsia="es-CO"/>
+                <w14:ligatures w14:val="none"/>
+              </w:rPr>
+              <w:t>Refinamiento y Planificación</w:t>
+            </w:r>
+          </w:p>
+        </w:tc>
+        <w:tc>
+          <w:tcPr>
+            <w:tcW w:w="0" w:type="auto"/>
+            <w:hideMark/>
+          </w:tcPr>
+          <w:p>
+            <w:pPr>
+              <w:spacing w:before="100" w:beforeAutospacing="1" w:after="100" w:afterAutospacing="1"/>
+              <w:rPr>
+                <w:rFonts w:ascii="Times New Roman" w:eastAsia="Times New Roman" w:hAnsi="Times New Roman" w:cs="Times New Roman"/>
+                <w:kern w:val="0"/>
+                <w:sz w:val="24"/>
+                <w:szCs w:val="24"/>
+                <w:lang w:eastAsia="es-CO"/>
+                <w14:ligatures w14:val="none"/>
+              </w:rPr>
+            </w:pPr>
+            <w:r>
+              <w:rPr>
+                <w:rFonts w:ascii="Times New Roman" w:eastAsia="Times New Roman" w:hAnsi="Times New Roman" w:cs="Times New Roman"/>
+                <w:kern w:val="0"/>
+                <w:sz w:val="24"/>
+                <w:szCs w:val="24"/>
+                <w:lang w:eastAsia="es-CO"/>
+                <w14:ligatures w14:val="none"/>
+              </w:rPr>
+              <w:t xml:space="preserve">Revisión técnica académica e inicio formal de Scrum. Configuración del tablero ágil en GitHub </w:t>
+            </w:r>
+            <w:proofErr w:type="spellStart"/>
+            <w:r>
+              <w:rPr>
+                <w:rFonts w:ascii="Times New Roman" w:eastAsia="Times New Roman" w:hAnsi="Times New Roman" w:cs="Times New Roman"/>
+                <w:kern w:val="0"/>
+                <w:sz w:val="24"/>
+                <w:szCs w:val="24"/>
+                <w:lang w:eastAsia="es-CO"/>
+                <w14:ligatures w14:val="none"/>
+              </w:rPr>
+              <w:t>Projects</w:t>
+            </w:r>
+            <w:proofErr w:type="spellEnd"/>
+            <w:r>
+              <w:rPr>
+                <w:rFonts w:ascii="Times New Roman" w:eastAsia="Times New Roman" w:hAnsi="Times New Roman" w:cs="Times New Roman"/>
+                <w:kern w:val="0"/>
+                <w:sz w:val="24"/>
+                <w:szCs w:val="24"/>
+                <w:lang w:eastAsia="es-CO"/>
+                <w14:ligatures w14:val="none"/>
+              </w:rPr>
+              <w:t>, estimación de esfuerzo (</w:t>
+            </w:r>
+            <w:proofErr w:type="spellStart"/>
+            <w:r>
+              <w:rPr>
+                <w:rFonts w:ascii="Times New Roman" w:eastAsia="Times New Roman" w:hAnsi="Times New Roman" w:cs="Times New Roman"/>
+                <w:kern w:val="0"/>
+                <w:sz w:val="24"/>
+                <w:szCs w:val="24"/>
+                <w:lang w:eastAsia="es-CO"/>
+                <w14:ligatures w14:val="none"/>
+              </w:rPr>
+              <w:t>Planning</w:t>
+            </w:r>
+            <w:proofErr w:type="spellEnd"/>
+            <w:r>
+              <w:rPr>
+                <w:rFonts w:ascii="Times New Roman" w:eastAsia="Times New Roman" w:hAnsi="Times New Roman" w:cs="Times New Roman"/>
+                <w:kern w:val="0"/>
+                <w:sz w:val="24"/>
+                <w:szCs w:val="24"/>
+                <w:lang w:eastAsia="es-CO"/>
+                <w14:ligatures w14:val="none"/>
+              </w:rPr>
+              <w:t xml:space="preserve"> Poker) y estandarización de historias</w:t>
+            </w:r>
+            <w:r>
+              <w:rPr>
+                <w:rFonts w:ascii="Times New Roman" w:eastAsia="Times New Roman" w:hAnsi="Times New Roman" w:cs="Times New Roman"/>
+                <w:kern w:val="0"/>
+                <w:sz w:val="24"/>
+                <w:szCs w:val="24"/>
+                <w:lang w:eastAsia="es-CO"/>
+                <w14:ligatures w14:val="none"/>
+              </w:rPr>
+              <w:t>, v</w:t>
+            </w:r>
+            <w:r>
+              <w:rPr>
+                <w:rFonts w:ascii="Times New Roman" w:eastAsia="Times New Roman" w:hAnsi="Times New Roman" w:cs="Times New Roman"/>
+                <w:kern w:val="0"/>
+                <w:sz w:val="24"/>
+                <w:szCs w:val="24"/>
+                <w:lang w:eastAsia="es-CO"/>
+                <w14:ligatures w14:val="none"/>
+              </w:rPr>
+              <w:t xml:space="preserve">alidación, </w:t>
+            </w:r>
+            <w:proofErr w:type="spellStart"/>
+            <w:r>
+              <w:rPr>
+                <w:rFonts w:ascii="Times New Roman" w:eastAsia="Times New Roman" w:hAnsi="Times New Roman" w:cs="Times New Roman"/>
+                <w:kern w:val="0"/>
+                <w:sz w:val="24"/>
+                <w:szCs w:val="24"/>
+                <w:lang w:eastAsia="es-CO"/>
+                <w14:ligatures w14:val="none"/>
+              </w:rPr>
+              <w:t>correcion</w:t>
+            </w:r>
+            <w:proofErr w:type="spellEnd"/>
+            <w:r>
+              <w:rPr>
+                <w:rFonts w:ascii="Times New Roman" w:eastAsia="Times New Roman" w:hAnsi="Times New Roman" w:cs="Times New Roman"/>
+                <w:kern w:val="0"/>
+                <w:sz w:val="24"/>
+                <w:szCs w:val="24"/>
+                <w:lang w:eastAsia="es-CO"/>
+                <w14:ligatures w14:val="none"/>
+              </w:rPr>
+              <w:t xml:space="preserve"> </w:t>
+            </w:r>
+            <w:r>
+              <w:rPr>
+                <w:rFonts w:ascii="Times New Roman" w:eastAsia="Times New Roman" w:hAnsi="Times New Roman" w:cs="Times New Roman"/>
+                <w:kern w:val="0"/>
+                <w:sz w:val="24"/>
+                <w:szCs w:val="24"/>
+                <w:lang w:eastAsia="es-CO"/>
+                <w14:ligatures w14:val="none"/>
+              </w:rPr>
+              <w:t xml:space="preserve">y </w:t>
+            </w:r>
+            <w:proofErr w:type="spellStart"/>
+            <w:r>
+              <w:rPr>
+                <w:rFonts w:ascii="Times New Roman" w:eastAsia="Times New Roman" w:hAnsi="Times New Roman" w:cs="Times New Roman"/>
+                <w:kern w:val="0"/>
+                <w:sz w:val="24"/>
+                <w:szCs w:val="24"/>
+                <w:lang w:eastAsia="es-CO"/>
+                <w14:ligatures w14:val="none"/>
+              </w:rPr>
+              <w:t>clasificaciónde</w:t>
+            </w:r>
+            <w:proofErr w:type="spellEnd"/>
+            <w:r>
+              <w:rPr>
+                <w:rFonts w:ascii="Times New Roman" w:eastAsia="Times New Roman" w:hAnsi="Times New Roman" w:cs="Times New Roman"/>
+                <w:kern w:val="0"/>
+                <w:sz w:val="24"/>
+                <w:szCs w:val="24"/>
+                <w:lang w:eastAsia="es-CO"/>
+                <w14:ligatures w14:val="none"/>
+              </w:rPr>
+              <w:t xml:space="preserve"> las historias de usuario</w:t>
+            </w:r>
+            <w:r>
+              <w:rPr>
+                <w:rFonts w:ascii="Times New Roman" w:eastAsia="Times New Roman" w:hAnsi="Times New Roman" w:cs="Times New Roman"/>
+                <w:kern w:val="0"/>
+                <w:sz w:val="24"/>
+                <w:szCs w:val="24"/>
+                <w:lang w:eastAsia="es-CO"/>
+                <w14:ligatures w14:val="none"/>
+              </w:rPr>
+              <w:t>.</w:t>
+            </w:r>
+          </w:p>
+        </w:tc>
+      </w:tr>
+      <w:tr>
+        <w:trPr>
+          <w:trHeight w:val="765"/>
+        </w:trPr>
+        <w:tc>
+          <w:tcPr>
+            <w:tcW w:w="0" w:type="auto"/>
+            <w:hideMark/>
+          </w:tcPr>
+          <w:p>
+            <w:pPr>
+              <w:spacing w:before="100" w:beforeAutospacing="1" w:after="100" w:afterAutospacing="1"/>
+              <w:rPr>
+                <w:rFonts w:ascii="Times New Roman" w:eastAsia="Times New Roman" w:hAnsi="Times New Roman" w:cs="Times New Roman"/>
+                <w:kern w:val="0"/>
+                <w:sz w:val="24"/>
+                <w:szCs w:val="24"/>
+                <w:lang w:eastAsia="es-CO"/>
+                <w14:ligatures w14:val="none"/>
+              </w:rPr>
+            </w:pPr>
+            <w:r>
+              <w:rPr>
+                <w:rFonts w:ascii="Times New Roman" w:eastAsia="Times New Roman" w:hAnsi="Times New Roman" w:cs="Times New Roman"/>
+                <w:b/>
+                <w:bCs/>
+                <w:kern w:val="0"/>
+                <w:sz w:val="24"/>
+                <w:szCs w:val="24"/>
+                <w:lang w:eastAsia="es-CO"/>
+                <w14:ligatures w14:val="none"/>
+              </w:rPr>
+              <w:t xml:space="preserve">15 al 18 </w:t>
+            </w:r>
+            <w:proofErr w:type="spellStart"/>
+            <w:r>
+              <w:rPr>
+                <w:rFonts w:ascii="Times New Roman" w:eastAsia="Times New Roman" w:hAnsi="Times New Roman" w:cs="Times New Roman"/>
+                <w:b/>
+                <w:bCs/>
+                <w:kern w:val="0"/>
+                <w:sz w:val="24"/>
+                <w:szCs w:val="24"/>
+                <w:lang w:eastAsia="es-CO"/>
+                <w14:ligatures w14:val="none"/>
+              </w:rPr>
+              <w:t>sep</w:t>
+            </w:r>
+            <w:proofErr w:type="spellEnd"/>
+          </w:p>
+        </w:tc>
+        <w:tc>
+          <w:tcPr>
+            <w:tcW w:w="0" w:type="auto"/>
+            <w:hideMark/>
+          </w:tcPr>
+          <w:p>
+            <w:pPr>
+              <w:spacing w:before="100" w:beforeAutospacing="1" w:after="100" w:afterAutospacing="1"/>
+              <w:rPr>
+                <w:rFonts w:ascii="Times New Roman" w:eastAsia="Times New Roman" w:hAnsi="Times New Roman" w:cs="Times New Roman"/>
+                <w:kern w:val="0"/>
+                <w:sz w:val="24"/>
+                <w:szCs w:val="24"/>
+                <w:lang w:eastAsia="es-CO"/>
+                <w14:ligatures w14:val="none"/>
+              </w:rPr>
+            </w:pPr>
+            <w:r>
+              <w:rPr>
+                <w:rFonts w:ascii="Times New Roman" w:eastAsia="Times New Roman" w:hAnsi="Times New Roman" w:cs="Times New Roman"/>
+                <w:kern w:val="0"/>
+                <w:sz w:val="24"/>
+                <w:szCs w:val="24"/>
+                <w:lang w:eastAsia="es-CO"/>
+                <w14:ligatures w14:val="none"/>
+              </w:rPr>
+              <w:t xml:space="preserve">Iteración 1 </w:t>
+            </w:r>
+          </w:p>
+        </w:tc>
+        <w:tc>
+          <w:tcPr>
+            <w:tcW w:w="0" w:type="auto"/>
+            <w:hideMark/>
+          </w:tcPr>
+          <w:p>
+            <w:pPr>
+              <w:spacing w:before="100" w:beforeAutospacing="1" w:after="100" w:afterAutospacing="1"/>
+              <w:rPr>
+                <w:rFonts w:ascii="Times New Roman" w:eastAsia="Times New Roman" w:hAnsi="Times New Roman" w:cs="Times New Roman"/>
+                <w:kern w:val="0"/>
+                <w:sz w:val="24"/>
+                <w:szCs w:val="24"/>
+                <w:lang w:eastAsia="es-CO"/>
+                <w14:ligatures w14:val="none"/>
+              </w:rPr>
+            </w:pPr>
+            <w:r>
+              <w:rPr>
+                <w:rFonts w:ascii="Times New Roman" w:eastAsia="Times New Roman" w:hAnsi="Times New Roman" w:cs="Times New Roman"/>
+                <w:kern w:val="0"/>
+                <w:sz w:val="24"/>
+                <w:szCs w:val="24"/>
+                <w:lang w:eastAsia="es-CO"/>
+                <w14:ligatures w14:val="none"/>
+              </w:rPr>
+              <w:t>Desarrollo de</w:t>
+            </w:r>
+            <w:r>
+              <w:rPr>
+                <w:rFonts w:ascii="Times New Roman" w:eastAsia="Times New Roman" w:hAnsi="Times New Roman" w:cs="Times New Roman"/>
+                <w:kern w:val="0"/>
+                <w:sz w:val="24"/>
+                <w:szCs w:val="24"/>
+                <w:lang w:eastAsia="es-CO"/>
+                <w14:ligatures w14:val="none"/>
+              </w:rPr>
+              <w:t xml:space="preserve"> historias de usuario:</w:t>
+            </w:r>
+            <w:r>
+              <w:rPr>
+                <w:rFonts w:ascii="Times New Roman" w:eastAsia="Times New Roman" w:hAnsi="Times New Roman" w:cs="Times New Roman"/>
+                <w:kern w:val="0"/>
+                <w:sz w:val="24"/>
+                <w:szCs w:val="24"/>
+                <w:lang w:eastAsia="es-CO"/>
+                <w14:ligatures w14:val="none"/>
+              </w:rPr>
+              <w:t xml:space="preserve"> HU-001 (Registro), HU-002 (Inicio de sesión), HU-003 (Crear viaje) y HU-004 (Visualización).</w:t>
+            </w:r>
+          </w:p>
+          <w:p>
+            <w:pPr>
+              <w:spacing w:before="100" w:beforeAutospacing="1" w:after="100" w:afterAutospacing="1"/>
+              <w:rPr>
+                <w:rFonts w:ascii="Times New Roman" w:eastAsia="Times New Roman" w:hAnsi="Times New Roman" w:cs="Times New Roman"/>
+                <w:kern w:val="0"/>
+                <w:sz w:val="24"/>
+                <w:szCs w:val="24"/>
+                <w:lang w:eastAsia="es-CO"/>
+                <w14:ligatures w14:val="none"/>
+              </w:rPr>
+            </w:pPr>
+          </w:p>
+        </w:tc>
+      </w:tr>
+      <w:tr>
+        <w:tc>
+          <w:tcPr>
+            <w:tcW w:w="0" w:type="auto"/>
+            <w:hideMark/>
+          </w:tcPr>
+          <w:p>
+            <w:pPr>
+              <w:spacing w:before="100" w:beforeAutospacing="1" w:after="100" w:afterAutospacing="1"/>
+              <w:rPr>
+                <w:rFonts w:ascii="Times New Roman" w:eastAsia="Times New Roman" w:hAnsi="Times New Roman" w:cs="Times New Roman"/>
+                <w:kern w:val="0"/>
+                <w:sz w:val="24"/>
+                <w:szCs w:val="24"/>
+                <w:lang w:eastAsia="es-CO"/>
+                <w14:ligatures w14:val="none"/>
+              </w:rPr>
+            </w:pPr>
+            <w:r>
+              <w:rPr>
+                <w:rFonts w:ascii="Times New Roman" w:eastAsia="Times New Roman" w:hAnsi="Times New Roman" w:cs="Times New Roman"/>
+                <w:b/>
+                <w:bCs/>
+                <w:kern w:val="0"/>
+                <w:sz w:val="24"/>
+                <w:szCs w:val="24"/>
+                <w:lang w:eastAsia="es-CO"/>
+                <w14:ligatures w14:val="none"/>
+              </w:rPr>
+              <w:t xml:space="preserve">Finales de </w:t>
+            </w:r>
+            <w:proofErr w:type="spellStart"/>
+            <w:r>
+              <w:rPr>
+                <w:rFonts w:ascii="Times New Roman" w:eastAsia="Times New Roman" w:hAnsi="Times New Roman" w:cs="Times New Roman"/>
+                <w:b/>
+                <w:bCs/>
+                <w:kern w:val="0"/>
+                <w:sz w:val="24"/>
+                <w:szCs w:val="24"/>
+                <w:lang w:eastAsia="es-CO"/>
+                <w14:ligatures w14:val="none"/>
+              </w:rPr>
+              <w:t>Sep</w:t>
+            </w:r>
+            <w:proofErr w:type="spellEnd"/>
+            <w:r>
+              <w:rPr>
+                <w:rFonts w:ascii="Times New Roman" w:eastAsia="Times New Roman" w:hAnsi="Times New Roman" w:cs="Times New Roman"/>
+                <w:b/>
+                <w:bCs/>
+                <w:kern w:val="0"/>
+                <w:sz w:val="24"/>
+                <w:szCs w:val="24"/>
+                <w:lang w:eastAsia="es-CO"/>
+                <w14:ligatures w14:val="none"/>
+              </w:rPr>
+              <w:t xml:space="preserve"> - Octubre</w:t>
+            </w:r>
+          </w:p>
+        </w:tc>
+        <w:tc>
+          <w:tcPr>
+            <w:tcW w:w="0" w:type="auto"/>
+            <w:hideMark/>
+          </w:tcPr>
+          <w:p>
+            <w:pPr>
+              <w:spacing w:before="100" w:beforeAutospacing="1" w:after="100" w:afterAutospacing="1"/>
+              <w:rPr>
+                <w:rFonts w:ascii="Times New Roman" w:eastAsia="Times New Roman" w:hAnsi="Times New Roman" w:cs="Times New Roman"/>
+                <w:kern w:val="0"/>
+                <w:sz w:val="24"/>
+                <w:szCs w:val="24"/>
+                <w:lang w:eastAsia="es-CO"/>
+                <w14:ligatures w14:val="none"/>
+              </w:rPr>
+            </w:pPr>
+            <w:r>
+              <w:rPr>
+                <w:rFonts w:ascii="Times New Roman" w:eastAsia="Times New Roman" w:hAnsi="Times New Roman" w:cs="Times New Roman"/>
+                <w:kern w:val="0"/>
+                <w:sz w:val="24"/>
+                <w:szCs w:val="24"/>
+                <w:lang w:eastAsia="es-CO"/>
+                <w14:ligatures w14:val="none"/>
+              </w:rPr>
+              <w:t>Sprint 2 y 3 (Desarrollo Iterativo)</w:t>
+            </w:r>
+          </w:p>
+        </w:tc>
+        <w:tc>
+          <w:tcPr>
+            <w:tcW w:w="0" w:type="auto"/>
+            <w:hideMark/>
+          </w:tcPr>
+          <w:p>
+            <w:pPr>
+              <w:spacing w:before="100" w:beforeAutospacing="1" w:after="100" w:afterAutospacing="1"/>
+              <w:rPr>
+                <w:rFonts w:ascii="Times New Roman" w:eastAsia="Times New Roman" w:hAnsi="Times New Roman" w:cs="Times New Roman"/>
+                <w:kern w:val="0"/>
+                <w:sz w:val="24"/>
+                <w:szCs w:val="24"/>
+                <w:lang w:eastAsia="es-CO"/>
+                <w14:ligatures w14:val="none"/>
+              </w:rPr>
+            </w:pPr>
+            <w:r>
+              <w:rPr>
+                <w:rFonts w:ascii="Times New Roman" w:eastAsia="Times New Roman" w:hAnsi="Times New Roman" w:cs="Times New Roman"/>
+                <w:kern w:val="0"/>
+                <w:sz w:val="24"/>
+                <w:szCs w:val="24"/>
+                <w:lang w:eastAsia="es-CO"/>
+                <w14:ligatures w14:val="none"/>
+              </w:rPr>
+              <w:t>Desarrollo de la</w:t>
+            </w:r>
+            <w:r>
+              <w:rPr>
+                <w:rFonts w:ascii="Times New Roman" w:eastAsia="Times New Roman" w:hAnsi="Times New Roman" w:cs="Times New Roman"/>
+                <w:kern w:val="0"/>
+                <w:sz w:val="24"/>
+                <w:szCs w:val="24"/>
+                <w:lang w:eastAsia="es-CO"/>
+                <w14:ligatures w14:val="none"/>
+              </w:rPr>
+              <w:t>s historias de usuario faltantes</w:t>
+            </w:r>
+            <w:r>
+              <w:rPr>
+                <w:rFonts w:ascii="Times New Roman" w:eastAsia="Times New Roman" w:hAnsi="Times New Roman" w:cs="Times New Roman"/>
+                <w:kern w:val="0"/>
+                <w:sz w:val="24"/>
+                <w:szCs w:val="24"/>
+                <w:lang w:eastAsia="es-CO"/>
+                <w14:ligatures w14:val="none"/>
+              </w:rPr>
+              <w:t>,</w:t>
+            </w:r>
+            <w:r>
+              <w:rPr>
+                <w:rFonts w:ascii="Times New Roman" w:eastAsia="Times New Roman" w:hAnsi="Times New Roman" w:cs="Times New Roman"/>
+                <w:kern w:val="0"/>
+                <w:sz w:val="24"/>
+                <w:szCs w:val="24"/>
+                <w:lang w:eastAsia="es-CO"/>
+                <w14:ligatures w14:val="none"/>
+              </w:rPr>
+              <w:t xml:space="preserve"> integración de </w:t>
+            </w:r>
+            <w:proofErr w:type="spellStart"/>
+            <w:proofErr w:type="gramStart"/>
+            <w:r>
+              <w:rPr>
+                <w:rFonts w:ascii="Times New Roman" w:eastAsia="Times New Roman" w:hAnsi="Times New Roman" w:cs="Times New Roman"/>
+                <w:kern w:val="0"/>
+                <w:sz w:val="24"/>
+                <w:szCs w:val="24"/>
+                <w:lang w:eastAsia="es-CO"/>
+                <w14:ligatures w14:val="none"/>
+              </w:rPr>
+              <w:t>APIs</w:t>
+            </w:r>
+            <w:proofErr w:type="spellEnd"/>
+            <w:r>
+              <w:rPr>
+                <w:rFonts w:ascii="Times New Roman" w:eastAsia="Times New Roman" w:hAnsi="Times New Roman" w:cs="Times New Roman"/>
+                <w:kern w:val="0"/>
+                <w:sz w:val="24"/>
+                <w:szCs w:val="24"/>
+                <w:lang w:eastAsia="es-CO"/>
+                <w14:ligatures w14:val="none"/>
+              </w:rPr>
+              <w:t xml:space="preserve"> </w:t>
+            </w:r>
+            <w:r>
+              <w:rPr>
+                <w:rFonts w:ascii="Times New Roman" w:eastAsia="Times New Roman" w:hAnsi="Times New Roman" w:cs="Times New Roman"/>
+                <w:kern w:val="0"/>
+                <w:sz w:val="24"/>
+                <w:szCs w:val="24"/>
+                <w:lang w:eastAsia="es-CO"/>
+                <w14:ligatures w14:val="none"/>
+              </w:rPr>
+              <w:t>.</w:t>
+            </w:r>
+            <w:proofErr w:type="gramEnd"/>
+          </w:p>
+        </w:tc>
+      </w:tr>
+      <w:tr>
+        <w:tc>
+          <w:tcPr>
+            <w:tcW w:w="0" w:type="auto"/>
+            <w:hideMark/>
+          </w:tcPr>
+          <w:p>
+            <w:pPr>
+              <w:spacing w:before="100" w:beforeAutospacing="1" w:after="100" w:afterAutospacing="1"/>
+              <w:rPr>
+                <w:rFonts w:ascii="Times New Roman" w:eastAsia="Times New Roman" w:hAnsi="Times New Roman" w:cs="Times New Roman"/>
+                <w:kern w:val="0"/>
+                <w:sz w:val="24"/>
+                <w:szCs w:val="24"/>
+                <w:lang w:eastAsia="es-CO"/>
+                <w14:ligatures w14:val="none"/>
+              </w:rPr>
+            </w:pPr>
+            <w:r>
+              <w:rPr>
+                <w:rFonts w:ascii="Times New Roman" w:eastAsia="Times New Roman" w:hAnsi="Times New Roman" w:cs="Times New Roman"/>
+                <w:b/>
+                <w:bCs/>
+                <w:kern w:val="0"/>
+                <w:sz w:val="24"/>
+                <w:szCs w:val="24"/>
+                <w:lang w:eastAsia="es-CO"/>
+                <w14:ligatures w14:val="none"/>
+              </w:rPr>
+              <w:t>Noviembre</w:t>
+            </w:r>
+          </w:p>
+        </w:tc>
+        <w:tc>
+          <w:tcPr>
+            <w:tcW w:w="0" w:type="auto"/>
+            <w:hideMark/>
+          </w:tcPr>
+          <w:p>
+            <w:pPr>
+              <w:spacing w:before="100" w:beforeAutospacing="1" w:after="100" w:afterAutospacing="1"/>
+              <w:rPr>
+                <w:rFonts w:ascii="Times New Roman" w:eastAsia="Times New Roman" w:hAnsi="Times New Roman" w:cs="Times New Roman"/>
+                <w:kern w:val="0"/>
+                <w:sz w:val="24"/>
+                <w:szCs w:val="24"/>
+                <w:lang w:eastAsia="es-CO"/>
+                <w14:ligatures w14:val="none"/>
+              </w:rPr>
+            </w:pPr>
+            <w:r>
+              <w:rPr>
+                <w:rFonts w:ascii="Times New Roman" w:eastAsia="Times New Roman" w:hAnsi="Times New Roman" w:cs="Times New Roman"/>
+                <w:kern w:val="0"/>
+                <w:sz w:val="24"/>
+                <w:szCs w:val="24"/>
+                <w:lang w:eastAsia="es-CO"/>
+                <w14:ligatures w14:val="none"/>
+              </w:rPr>
+              <w:t>Pruebas y Cierre</w:t>
+            </w:r>
+          </w:p>
+        </w:tc>
+        <w:tc>
+          <w:tcPr>
+            <w:tcW w:w="0" w:type="auto"/>
+            <w:hideMark/>
+          </w:tcPr>
+          <w:p>
+            <w:pPr>
+              <w:spacing w:before="100" w:beforeAutospacing="1" w:after="100" w:afterAutospacing="1"/>
+              <w:rPr>
+                <w:rFonts w:ascii="Times New Roman" w:eastAsia="Times New Roman" w:hAnsi="Times New Roman" w:cs="Times New Roman"/>
+                <w:kern w:val="0"/>
+                <w:sz w:val="24"/>
+                <w:szCs w:val="24"/>
+                <w:lang w:eastAsia="es-CO"/>
+                <w14:ligatures w14:val="none"/>
+              </w:rPr>
+            </w:pPr>
+            <w:r>
+              <w:rPr>
+                <w:rFonts w:ascii="Times New Roman" w:eastAsia="Times New Roman" w:hAnsi="Times New Roman" w:cs="Times New Roman"/>
+                <w:kern w:val="0"/>
+                <w:sz w:val="24"/>
+                <w:szCs w:val="24"/>
+                <w:lang w:eastAsia="es-CO"/>
+                <w14:ligatures w14:val="none"/>
+              </w:rPr>
+              <w:t xml:space="preserve">Fase de pruebas de calidad, </w:t>
+            </w:r>
+            <w:r>
+              <w:rPr>
+                <w:rFonts w:ascii="Times New Roman" w:eastAsia="Times New Roman" w:hAnsi="Times New Roman" w:cs="Times New Roman"/>
+                <w:kern w:val="0"/>
+                <w:sz w:val="24"/>
+                <w:szCs w:val="24"/>
+                <w:lang w:eastAsia="es-CO"/>
+                <w14:ligatures w14:val="none"/>
+              </w:rPr>
+              <w:t xml:space="preserve">solución </w:t>
+            </w:r>
+            <w:r>
+              <w:rPr>
+                <w:rFonts w:ascii="Times New Roman" w:eastAsia="Times New Roman" w:hAnsi="Times New Roman" w:cs="Times New Roman"/>
+                <w:kern w:val="0"/>
+                <w:sz w:val="24"/>
+                <w:szCs w:val="24"/>
+                <w:lang w:eastAsia="es-CO"/>
+                <w14:ligatures w14:val="none"/>
+              </w:rPr>
+              <w:t>de bug</w:t>
+            </w:r>
+            <w:r>
+              <w:rPr>
+                <w:rFonts w:ascii="Times New Roman" w:eastAsia="Times New Roman" w:hAnsi="Times New Roman" w:cs="Times New Roman"/>
+                <w:i/>
+                <w:iCs/>
+                <w:kern w:val="0"/>
+                <w:sz w:val="24"/>
+                <w:szCs w:val="24"/>
+                <w:lang w:eastAsia="es-CO"/>
+                <w14:ligatures w14:val="none"/>
+              </w:rPr>
+              <w:t>s</w:t>
+            </w:r>
+            <w:r>
+              <w:rPr>
+                <w:rFonts w:ascii="Times New Roman" w:eastAsia="Times New Roman" w:hAnsi="Times New Roman" w:cs="Times New Roman"/>
+                <w:kern w:val="0"/>
+                <w:sz w:val="24"/>
+                <w:szCs w:val="24"/>
+                <w:lang w:eastAsia="es-CO"/>
+                <w14:ligatures w14:val="none"/>
+              </w:rPr>
+              <w:t>, refinamiento final de la interfaz gráfica y preparación para la entrega y sustentación final del proyecto</w:t>
+            </w:r>
+          </w:p>
+        </w:tc>
+      </w:tr>
+    </w:tbl>
+    <w:p/>
+    <w:p>
+      <w:r>
+        <w:br w:type="page"/>
+      </w:r>
+    </w:p>
+    <w:p>
+      <w:pPr>
+        <w:pStyle w:val="Ttulo1"/>
+      </w:pPr>
+      <w:bookmarkStart w:id="7" w:name="_Toc240394457"/>
+      <w:r>
+        <w:lastRenderedPageBreak/>
+        <w:t>Organigrama</w:t>
+      </w:r>
+      <w:bookmarkEnd w:id="7"/>
+    </w:p>
+    <w:p>
+      <w:r>
+        <w:rPr>
+          <w:noProof/>
+        </w:rPr>
+        <w:drawing>
+          <wp:inline distT="0" distB="0" distL="0" distR="0" wp14:anchorId="1F313A1D" wp14:editId="3E8F359D">
+            <wp:extent cx="5612130" cy="1751330"/>
+            <wp:effectExtent l="0" t="0" r="0" b="0"/>
+            <wp:docPr id="1" name="Imagen 1"/>
+            <wp:cNvGraphicFramePr>
+              <a:graphicFrameLocks xmlns:a="http://schemas.openxmlformats.org/drawingml/2006/main" noChangeAspect="1"/>
+            </wp:cNvGraphicFramePr>
+            <a:graphic xmlns:a="http://schemas.openxmlformats.org/drawingml/2006/main">
+              <a:graphicData uri="http://schemas.openxmlformats.org/drawingml/2006/picture">
+                <pic:pic xmlns:pic="http://schemas.openxmlformats.org/drawingml/2006/picture">
+                  <pic:nvPicPr>
+                    <pic:cNvPr id="1" name=""/>
+                    <pic:cNvPicPr/>
+                  </pic:nvPicPr>
+                  <pic:blipFill>
+                    <a:blip r:embed="rId7"/>
+                    <a:stretch>
+                      <a:fillRect/>
+                    </a:stretch>
+                  </pic:blipFill>
+                  <pic:spPr>
+                    <a:xfrm>
+                      <a:off x="0" y="0"/>
+                      <a:ext cx="5612130" cy="1751330"/>
+                    </a:xfrm>
+                    <a:prstGeom prst="rect">
+                      <a:avLst/>
+                    </a:prstGeom>
+                  </pic:spPr>
+                </pic:pic>
+              </a:graphicData>
+            </a:graphic>
+          </wp:inline>
+        </w:drawing>
+      </w:r>
+    </w:p>
+    <w:p>
+      <w:pPr>
+        <w:rPr>
+          <w:rFonts w:ascii="Times New Roman" w:hAnsi="Times New Roman" w:cs="Times New Roman"/>
+        </w:rPr>
+      </w:pPr>
+      <w:r>
+        <w:rPr>
+          <w:noProof/>
+        </w:rPr>
+        <w:drawing>
+          <wp:inline distT="0" distB="0" distL="0" distR="0" wp14:anchorId="1708A207" wp14:editId="413C9FCA">
+            <wp:extent cx="5612130" cy="1675130"/>
+            <wp:effectExtent l="0" t="0" r="0" b="0"/>
+            <wp:docPr id="2" name="Imagen 2"/>
+            <wp:cNvGraphicFramePr>
+              <a:graphicFrameLocks xmlns:a="http://schemas.openxmlformats.org/drawingml/2006/main" noChangeAspect="1"/>
+            </wp:cNvGraphicFramePr>
+            <a:graphic xmlns:a="http://schemas.openxmlformats.org/drawingml/2006/main">
+              <a:graphicData uri="http://schemas.openxmlformats.org/drawingml/2006/picture">
+                <pic:pic xmlns:pic="http://schemas.openxmlformats.org/drawingml/2006/picture">
+                  <pic:nvPicPr>
+                    <pic:cNvPr id="1" name=""/>
+                    <pic:cNvPicPr/>
+                  </pic:nvPicPr>
+                  <pic:blipFill>
+                    <a:blip r:embed="rId8"/>
+                    <a:stretch>
+                      <a:fillRect/>
+                    </a:stretch>
+                  </pic:blipFill>
+                  <pic:spPr>
+                    <a:xfrm>
+                      <a:off x="0" y="0"/>
+                      <a:ext cx="5612130" cy="1675130"/>
+                    </a:xfrm>
+                    <a:prstGeom prst="rect">
+                      <a:avLst/>
+                    </a:prstGeom>
+                  </pic:spPr>
+                </pic:pic>
+              </a:graphicData>
+            </a:graphic>
+          </wp:inline>
+        </w:drawing>
       </w:r>
     </w:p>
     <w:p>
@@ -4054,6 +7095,30 @@
       <w14:ligatures w14:val="none"/>
     </w:rPr>
   </w:style>
+  <w:style w:type="table" w:styleId="Tablaconcuadrcula">
+    <w:name w:val="Table Grid"/>
+    <w:basedOn w:val="Tablanormal"/>
+    <w:uiPriority w:val="39"/>
+    <w:rsid w:val="007A73EB"/>
+    <w:pPr>
+      <w:spacing w:after="0" w:line="240" w:lineRule="auto"/>
+      <w:ind w:firstLine="0"/>
+    </w:pPr>
+    <w:rPr>
+      <w:sz w:val="22"/>
+      <w:szCs w:val="22"/>
+    </w:rPr>
+    <w:tblPr>
+      <w:tblBorders>
+        <w:top w:val="single" w:sz="4" w:space="0" w:color="auto"/>
+        <w:left w:val="single" w:sz="4" w:space="0" w:color="auto"/>
+        <w:bottom w:val="single" w:sz="4" w:space="0" w:color="auto"/>
+        <w:right w:val="single" w:sz="4" w:space="0" w:color="auto"/>
+        <w:insideH w:val="single" w:sz="4" w:space="0" w:color="auto"/>
+        <w:insideV w:val="single" w:sz="4" w:space="0" w:color="auto"/>
+      </w:tblBorders>
+    </w:tblPr>
+  </w:style>
 </w:styles>
 </file>
 

</xml_diff>